<commit_message>
- Implemented asset maintenance history feature with add, edit, and delete functionalities. - Created asset rental history
</commit_message>
<xml_diff>
--- a/πτυχιακη.docx
+++ b/πτυχιακη.docx
@@ -8083,13 +8083,16 @@
       </w:r>
     </w:p>
     <w:p>
-      <w:proofErr w:type="spellStart"/>
-      <w:r>
-        <w:t>User</w:t>
-      </w:r>
-      <w:proofErr w:type="spellEnd"/>
-      <w:r>
-        <w:t xml:space="preserve"> A</w:t>
+      <w:pPr>
+        <w:rPr>
+          <w:lang w:val="en-US"/>
+        </w:rPr>
+      </w:pPr>
+      <w:r>
+        <w:rPr>
+          <w:lang w:val="en-US"/>
+        </w:rPr>
+        <w:t>User A</w:t>
       </w:r>
     </w:p>
     <w:p>
@@ -11981,7 +11984,15 @@
       </w:r>
       <w:proofErr w:type="spellEnd"/>
       <w:r>
-        <w:t xml:space="preserve"> Case </w:t>
+        <w:t xml:space="preserve"> </w:t>
+      </w:r>
+      <w:proofErr w:type="spellStart"/>
+      <w:r>
+        <w:t>Case</w:t>
+      </w:r>
+      <w:proofErr w:type="spellEnd"/>
+      <w:r>
+        <w:t xml:space="preserve"> </w:t>
       </w:r>
       <w:proofErr w:type="spellStart"/>
       <w:r>
@@ -12272,42 +12283,98 @@
         <w:jc w:val="both"/>
         <w:rPr>
           <w:color w:val="000000" w:themeColor="text1"/>
+        </w:rPr>
+      </w:pPr>
+      <w:r>
+        <w:rPr>
+          <w:color w:val="000000" w:themeColor="text1"/>
+        </w:rPr>
+        <w:t>Το πρώτο διάγραμμα επικεντρώνεται στις λειτουργίες διαχείρισης υποδομής και παραμετροποίησης. Εμπλέκει τον Διαχειριστή Συστήματος (</w:t>
+      </w:r>
+      <w:proofErr w:type="spellStart"/>
+      <w:r>
+        <w:rPr>
+          <w:color w:val="000000" w:themeColor="text1"/>
+        </w:rPr>
+        <w:t>System</w:t>
+      </w:r>
+      <w:proofErr w:type="spellEnd"/>
+      <w:r>
+        <w:rPr>
+          <w:color w:val="000000" w:themeColor="text1"/>
+        </w:rPr>
+        <w:t xml:space="preserve"> </w:t>
+      </w:r>
+      <w:proofErr w:type="spellStart"/>
+      <w:r>
+        <w:rPr>
+          <w:color w:val="000000" w:themeColor="text1"/>
+        </w:rPr>
+        <w:t>Administrator</w:t>
+      </w:r>
+      <w:proofErr w:type="spellEnd"/>
+      <w:r>
+        <w:rPr>
+          <w:color w:val="000000" w:themeColor="text1"/>
+        </w:rPr>
+        <w:t xml:space="preserve">- </w:t>
+      </w:r>
+      <w:proofErr w:type="spellStart"/>
+      <w:r>
+        <w:rPr>
+          <w:color w:val="000000" w:themeColor="text1"/>
           <w:lang w:val="en-US"/>
         </w:rPr>
-      </w:pPr>
-      <w:r>
-        <w:rPr>
-          <w:color w:val="000000" w:themeColor="text1"/>
-        </w:rPr>
-        <w:t>Το πρώτο διάγραμμα επικεντρώνεται στις λειτουργίες διαχείρισης υποδομής και παραμετροποίησης. Εμπλέκει τον Διαχειριστή Συστήματος (</w:t>
-      </w:r>
-      <w:proofErr w:type="spellStart"/>
-      <w:r>
-        <w:rPr>
-          <w:color w:val="000000" w:themeColor="text1"/>
-        </w:rPr>
-        <w:t>System</w:t>
-      </w:r>
-      <w:proofErr w:type="spellEnd"/>
-      <w:r>
-        <w:rPr>
-          <w:color w:val="000000" w:themeColor="text1"/>
-        </w:rPr>
-        <w:t xml:space="preserve"> </w:t>
-      </w:r>
-      <w:proofErr w:type="spellStart"/>
-      <w:r>
-        <w:rPr>
-          <w:color w:val="000000" w:themeColor="text1"/>
-        </w:rPr>
-        <w:t>Administrator</w:t>
-      </w:r>
-      <w:proofErr w:type="spellEnd"/>
-      <w:r>
-        <w:rPr>
-          <w:color w:val="000000" w:themeColor="text1"/>
-        </w:rPr>
-        <w:t xml:space="preserve">- </w:t>
+        <w:t>superAdmin</w:t>
+      </w:r>
+      <w:proofErr w:type="spellEnd"/>
+      <w:r>
+        <w:rPr>
+          <w:color w:val="000000" w:themeColor="text1"/>
+        </w:rPr>
+        <w:t xml:space="preserve">), ο οποίος ανήκει στον </w:t>
+      </w:r>
+      <w:proofErr w:type="spellStart"/>
+      <w:r>
+        <w:rPr>
+          <w:color w:val="000000" w:themeColor="text1"/>
+        </w:rPr>
+        <w:t>πάροχο</w:t>
+      </w:r>
+      <w:proofErr w:type="spellEnd"/>
+      <w:r>
+        <w:rPr>
+          <w:color w:val="000000" w:themeColor="text1"/>
+        </w:rPr>
+        <w:t xml:space="preserve"> του λογισμικού, και τον Διαχειριστή Εταιρείας (</w:t>
+      </w:r>
+      <w:proofErr w:type="spellStart"/>
+      <w:r>
+        <w:rPr>
+          <w:color w:val="000000" w:themeColor="text1"/>
+        </w:rPr>
+        <w:t>Tenant</w:t>
+      </w:r>
+      <w:proofErr w:type="spellEnd"/>
+      <w:r>
+        <w:rPr>
+          <w:color w:val="000000" w:themeColor="text1"/>
+        </w:rPr>
+        <w:t xml:space="preserve"> </w:t>
+      </w:r>
+      <w:proofErr w:type="spellStart"/>
+      <w:r>
+        <w:rPr>
+          <w:color w:val="000000" w:themeColor="text1"/>
+        </w:rPr>
+        <w:t>Admin</w:t>
+      </w:r>
+      <w:proofErr w:type="spellEnd"/>
+      <w:r>
+        <w:rPr>
+          <w:color w:val="000000" w:themeColor="text1"/>
+        </w:rPr>
+        <w:t xml:space="preserve">). Ο </w:t>
       </w:r>
       <w:proofErr w:type="spellStart"/>
       <w:r>
@@ -12322,21 +12389,27 @@
         <w:rPr>
           <w:color w:val="000000" w:themeColor="text1"/>
         </w:rPr>
-        <w:t xml:space="preserve">), ο οποίος ανήκει στον </w:t>
-      </w:r>
-      <w:proofErr w:type="spellStart"/>
-      <w:r>
-        <w:rPr>
-          <w:color w:val="000000" w:themeColor="text1"/>
-        </w:rPr>
-        <w:t>πάροχο</w:t>
-      </w:r>
-      <w:proofErr w:type="spellEnd"/>
-      <w:r>
-        <w:rPr>
-          <w:color w:val="000000" w:themeColor="text1"/>
-        </w:rPr>
-        <w:t xml:space="preserve"> του λογισμικού, και τον Διαχειριστή Εταιρείας (</w:t>
+        <w:t xml:space="preserve"> </w:t>
+      </w:r>
+      <w:r>
+        <w:rPr>
+          <w:color w:val="000000" w:themeColor="text1"/>
+        </w:rPr>
+        <w:t xml:space="preserve">έχει τη δυνατότητα να δημιουργεί νέα </w:t>
+      </w:r>
+      <w:proofErr w:type="spellStart"/>
+      <w:r>
+        <w:rPr>
+          <w:color w:val="000000" w:themeColor="text1"/>
+        </w:rPr>
+        <w:t>Tenants</w:t>
+      </w:r>
+      <w:proofErr w:type="spellEnd"/>
+      <w:r>
+        <w:rPr>
+          <w:color w:val="000000" w:themeColor="text1"/>
+        </w:rPr>
+        <w:t xml:space="preserve"> (Εταιρείες) και να ελέγχει την κατάσταση των συνδρομών τους. Από την άλλη πλευρά, ο </w:t>
       </w:r>
       <w:proofErr w:type="spellStart"/>
       <w:r>
@@ -12364,190 +12437,127 @@
         <w:rPr>
           <w:color w:val="000000" w:themeColor="text1"/>
         </w:rPr>
-        <w:t xml:space="preserve">). Ο </w:t>
-      </w:r>
-      <w:proofErr w:type="spellStart"/>
+        <w:t xml:space="preserve"> αναλαμβάνει την εσωτερική παραμετροποίηση της εταιρείας του, εκτελώντας κρίσιμες λειτουργίες όπως η δυναμική δημιουργία Τύπων Παγίων (</w:t>
+      </w:r>
+      <w:proofErr w:type="spellStart"/>
+      <w:r>
+        <w:rPr>
+          <w:color w:val="000000" w:themeColor="text1"/>
+        </w:rPr>
+        <w:t>Asset</w:t>
+      </w:r>
+      <w:proofErr w:type="spellEnd"/>
+      <w:r>
+        <w:rPr>
+          <w:color w:val="000000" w:themeColor="text1"/>
+        </w:rPr>
+        <w:t xml:space="preserve"> </w:t>
+      </w:r>
+      <w:proofErr w:type="spellStart"/>
+      <w:r>
+        <w:rPr>
+          <w:color w:val="000000" w:themeColor="text1"/>
+        </w:rPr>
+        <w:t>Types</w:t>
+      </w:r>
+      <w:proofErr w:type="spellEnd"/>
+      <w:r>
+        <w:rPr>
+          <w:color w:val="000000" w:themeColor="text1"/>
+        </w:rPr>
+        <w:t>) μέσω του EAV και η αποστολή προσκλήσεων (</w:t>
+      </w:r>
+      <w:proofErr w:type="spellStart"/>
+      <w:r>
+        <w:rPr>
+          <w:color w:val="000000" w:themeColor="text1"/>
+        </w:rPr>
+        <w:t>Invitations</w:t>
+      </w:r>
+      <w:proofErr w:type="spellEnd"/>
+      <w:r>
+        <w:rPr>
+          <w:color w:val="000000" w:themeColor="text1"/>
+        </w:rPr>
+        <w:t xml:space="preserve">) για την εγγραφή νέων υπαλλήλων στο προστατευμένο περιβάλλον του </w:t>
+      </w:r>
+      <w:proofErr w:type="spellStart"/>
+      <w:r>
+        <w:rPr>
+          <w:color w:val="000000" w:themeColor="text1"/>
+        </w:rPr>
+        <w:t>Tenant</w:t>
+      </w:r>
+      <w:proofErr w:type="spellEnd"/>
+      <w:r>
+        <w:rPr>
+          <w:color w:val="000000" w:themeColor="text1"/>
+        </w:rPr>
+        <w:t xml:space="preserve"> </w:t>
+      </w:r>
+      <w:r>
+        <w:rPr>
+          <w:color w:val="000000" w:themeColor="text1"/>
+        </w:rPr>
+        <w:t>τη</w:t>
+      </w:r>
+      <w:r>
+        <w:rPr>
+          <w:color w:val="000000" w:themeColor="text1"/>
+        </w:rPr>
+        <w:t xml:space="preserve">ν ή την </w:t>
+      </w:r>
+      <w:r>
+        <w:rPr>
+          <w:color w:val="000000" w:themeColor="text1"/>
+        </w:rPr>
+        <w:t xml:space="preserve"> απενεργοποίηση αυτών</w:t>
+      </w:r>
+      <w:r>
+        <w:rPr>
+          <w:color w:val="000000" w:themeColor="text1"/>
+        </w:rPr>
+        <w:t xml:space="preserve"> καθώς </w:t>
+      </w:r>
+      <w:r>
+        <w:rPr>
+          <w:color w:val="000000" w:themeColor="text1"/>
+        </w:rPr>
+        <w:t xml:space="preserve">δύναται και να </w:t>
+      </w:r>
+      <w:proofErr w:type="spellStart"/>
+      <w:r>
+        <w:rPr>
+          <w:color w:val="000000" w:themeColor="text1"/>
+        </w:rPr>
+        <w:t>αλλαξει</w:t>
+      </w:r>
+      <w:proofErr w:type="spellEnd"/>
+      <w:r>
+        <w:rPr>
+          <w:color w:val="000000" w:themeColor="text1"/>
+        </w:rPr>
+        <w:t xml:space="preserve"> το ρόλο του υπαλλήλου (από </w:t>
+      </w:r>
+      <w:proofErr w:type="spellStart"/>
+      <w:r>
+        <w:rPr>
+          <w:color w:val="000000" w:themeColor="text1"/>
+        </w:rPr>
+        <w:t>απλο</w:t>
+      </w:r>
+      <w:proofErr w:type="spellEnd"/>
+      <w:r>
+        <w:rPr>
+          <w:color w:val="000000" w:themeColor="text1"/>
+        </w:rPr>
+        <w:t xml:space="preserve"> χρήστη σε </w:t>
+      </w:r>
       <w:r>
         <w:rPr>
           <w:color w:val="000000" w:themeColor="text1"/>
           <w:lang w:val="en-US"/>
         </w:rPr>
-        <w:t>superAdmin</w:t>
-      </w:r>
-      <w:proofErr w:type="spellEnd"/>
-      <w:r>
-        <w:rPr>
-          <w:color w:val="000000" w:themeColor="text1"/>
-        </w:rPr>
-        <w:t xml:space="preserve"> </w:t>
-      </w:r>
-      <w:r>
-        <w:rPr>
-          <w:color w:val="000000" w:themeColor="text1"/>
-        </w:rPr>
-        <w:t xml:space="preserve">έχει τη δυνατότητα να δημιουργεί νέα </w:t>
-      </w:r>
-      <w:proofErr w:type="spellStart"/>
-      <w:r>
-        <w:rPr>
-          <w:color w:val="000000" w:themeColor="text1"/>
-        </w:rPr>
-        <w:t>Tenants</w:t>
-      </w:r>
-      <w:proofErr w:type="spellEnd"/>
-      <w:r>
-        <w:rPr>
-          <w:color w:val="000000" w:themeColor="text1"/>
-        </w:rPr>
-        <w:t xml:space="preserve"> (Εταιρείες) και να ελέγχει την κατάσταση των συνδρομών τους. Από την άλλη πλευρά, ο </w:t>
-      </w:r>
-      <w:proofErr w:type="spellStart"/>
-      <w:r>
-        <w:rPr>
-          <w:color w:val="000000" w:themeColor="text1"/>
-        </w:rPr>
-        <w:t>Tenant</w:t>
-      </w:r>
-      <w:proofErr w:type="spellEnd"/>
-      <w:r>
-        <w:rPr>
-          <w:color w:val="000000" w:themeColor="text1"/>
-        </w:rPr>
-        <w:t xml:space="preserve"> </w:t>
-      </w:r>
-      <w:proofErr w:type="spellStart"/>
-      <w:r>
-        <w:rPr>
-          <w:color w:val="000000" w:themeColor="text1"/>
-        </w:rPr>
-        <w:t>Admin</w:t>
-      </w:r>
-      <w:proofErr w:type="spellEnd"/>
-      <w:r>
-        <w:rPr>
-          <w:color w:val="000000" w:themeColor="text1"/>
-        </w:rPr>
-        <w:t xml:space="preserve"> αναλαμβάνει την εσωτερική παραμετροποίηση της εταιρείας του, εκτελώντας κρίσιμες λειτουργίες όπως η δυναμική δημιουργία Τύπων Παγίων (</w:t>
-      </w:r>
-      <w:proofErr w:type="spellStart"/>
-      <w:r>
-        <w:rPr>
-          <w:color w:val="000000" w:themeColor="text1"/>
-        </w:rPr>
-        <w:t>Asset</w:t>
-      </w:r>
-      <w:proofErr w:type="spellEnd"/>
-      <w:r>
-        <w:rPr>
-          <w:color w:val="000000" w:themeColor="text1"/>
-        </w:rPr>
-        <w:t xml:space="preserve"> </w:t>
-      </w:r>
-      <w:proofErr w:type="spellStart"/>
-      <w:r>
-        <w:rPr>
-          <w:color w:val="000000" w:themeColor="text1"/>
-        </w:rPr>
-        <w:t>Types</w:t>
-      </w:r>
-      <w:proofErr w:type="spellEnd"/>
-      <w:r>
-        <w:rPr>
-          <w:color w:val="000000" w:themeColor="text1"/>
-        </w:rPr>
-        <w:t>) μέσω του EAV και η αποστολή προσκλήσεων (</w:t>
-      </w:r>
-      <w:proofErr w:type="spellStart"/>
-      <w:r>
-        <w:rPr>
-          <w:color w:val="000000" w:themeColor="text1"/>
-        </w:rPr>
-        <w:t>Invitations</w:t>
-      </w:r>
-      <w:proofErr w:type="spellEnd"/>
-      <w:r>
-        <w:rPr>
-          <w:color w:val="000000" w:themeColor="text1"/>
-        </w:rPr>
-        <w:t xml:space="preserve">) για την εγγραφή νέων υπαλλήλων στο προστατευμένο περιβάλλον του </w:t>
-      </w:r>
-      <w:proofErr w:type="spellStart"/>
-      <w:r>
-        <w:rPr>
-          <w:color w:val="000000" w:themeColor="text1"/>
-        </w:rPr>
-        <w:t>Tenant</w:t>
-      </w:r>
-      <w:proofErr w:type="spellEnd"/>
-      <w:r>
-        <w:rPr>
-          <w:color w:val="000000" w:themeColor="text1"/>
-        </w:rPr>
-        <w:t xml:space="preserve"> </w:t>
-      </w:r>
-      <w:r>
-        <w:rPr>
-          <w:color w:val="000000" w:themeColor="text1"/>
-        </w:rPr>
-        <w:t>τη</w:t>
-      </w:r>
-      <w:r>
-        <w:rPr>
-          <w:color w:val="000000" w:themeColor="text1"/>
-        </w:rPr>
-        <w:t xml:space="preserve">ν ή την </w:t>
-      </w:r>
-      <w:r>
-        <w:rPr>
-          <w:color w:val="000000" w:themeColor="text1"/>
-        </w:rPr>
-        <w:t xml:space="preserve"> απενεργοποίηση αυτών</w:t>
-      </w:r>
-      <w:r>
-        <w:rPr>
-          <w:color w:val="000000" w:themeColor="text1"/>
-        </w:rPr>
-        <w:t xml:space="preserve"> καθώς </w:t>
-      </w:r>
-      <w:r>
-        <w:rPr>
-          <w:color w:val="000000" w:themeColor="text1"/>
-        </w:rPr>
-        <w:t xml:space="preserve">δύναται και να </w:t>
-      </w:r>
-      <w:proofErr w:type="spellStart"/>
-      <w:r>
-        <w:rPr>
-          <w:color w:val="000000" w:themeColor="text1"/>
-        </w:rPr>
-        <w:t>αλλαξει</w:t>
-      </w:r>
-      <w:proofErr w:type="spellEnd"/>
-      <w:r>
-        <w:rPr>
-          <w:color w:val="000000" w:themeColor="text1"/>
-        </w:rPr>
-        <w:t xml:space="preserve"> το ρόλο του υπαλλήλου (από </w:t>
-      </w:r>
-      <w:proofErr w:type="spellStart"/>
-      <w:r>
-        <w:rPr>
-          <w:color w:val="000000" w:themeColor="text1"/>
-        </w:rPr>
-        <w:t>απλο</w:t>
-      </w:r>
-      <w:proofErr w:type="spellEnd"/>
-      <w:r>
-        <w:rPr>
-          <w:color w:val="000000" w:themeColor="text1"/>
-        </w:rPr>
-        <w:t xml:space="preserve"> χρήστη σε </w:t>
-      </w:r>
-      <w:r>
-        <w:rPr>
-          <w:color w:val="000000" w:themeColor="text1"/>
-          <w:lang w:val="en-US"/>
-        </w:rPr>
         <w:t>admin</w:t>
       </w:r>
       <w:r>
@@ -12569,7 +12579,6 @@
         <w:rPr>
           <w:noProof/>
           <w:color w:val="000000" w:themeColor="text1"/>
-          <w:lang w:val="en-US"/>
         </w:rPr>
       </w:pPr>
     </w:p>
@@ -15300,7 +15309,6 @@
           <w:b/>
           <w:bCs/>
           <w:color w:val="000000" w:themeColor="text1"/>
-          <w:lang w:val="en-US"/>
         </w:rPr>
       </w:pPr>
       <w:r>
@@ -16265,7 +16273,6 @@
         <w:jc w:val="both"/>
         <w:rPr>
           <w:color w:val="000000" w:themeColor="text1"/>
-          <w:lang w:val="en-US"/>
         </w:rPr>
       </w:pPr>
     </w:p>
@@ -16298,18 +16305,16 @@
           <w:b/>
           <w:bCs/>
           <w:color w:val="000000" w:themeColor="text1"/>
-          <w:lang w:val="en-US"/>
-        </w:rPr>
-      </w:pPr>
-    </w:p>
-    <w:p>
-      <w:pPr>
-        <w:jc w:val="both"/>
-        <w:rPr>
-          <w:b/>
-          <w:bCs/>
-          <w:color w:val="000000" w:themeColor="text1"/>
-          <w:lang w:val="en-US"/>
+        </w:rPr>
+      </w:pPr>
+    </w:p>
+    <w:p>
+      <w:pPr>
+        <w:jc w:val="both"/>
+        <w:rPr>
+          <w:b/>
+          <w:bCs/>
+          <w:color w:val="000000" w:themeColor="text1"/>
         </w:rPr>
       </w:pPr>
       <w:r>
@@ -16453,18 +16458,16 @@
           <w:b/>
           <w:bCs/>
           <w:color w:val="000000" w:themeColor="text1"/>
-          <w:lang w:val="en-US"/>
-        </w:rPr>
-      </w:pPr>
-    </w:p>
-    <w:p>
-      <w:pPr>
-        <w:jc w:val="both"/>
-        <w:rPr>
-          <w:b/>
-          <w:bCs/>
-          <w:color w:val="000000" w:themeColor="text1"/>
-          <w:lang w:val="en-US"/>
+        </w:rPr>
+      </w:pPr>
+    </w:p>
+    <w:p>
+      <w:pPr>
+        <w:jc w:val="both"/>
+        <w:rPr>
+          <w:b/>
+          <w:bCs/>
+          <w:color w:val="000000" w:themeColor="text1"/>
         </w:rPr>
       </w:pPr>
       <w:r>
@@ -16629,18 +16632,16 @@
         <w:jc w:val="both"/>
         <w:rPr>
           <w:color w:val="000000" w:themeColor="text1"/>
-          <w:lang w:val="en-US"/>
-        </w:rPr>
-      </w:pPr>
-    </w:p>
-    <w:p>
-      <w:pPr>
-        <w:jc w:val="both"/>
-        <w:rPr>
-          <w:b/>
-          <w:bCs/>
-          <w:color w:val="000000" w:themeColor="text1"/>
-          <w:lang w:val="en-US"/>
+        </w:rPr>
+      </w:pPr>
+    </w:p>
+    <w:p>
+      <w:pPr>
+        <w:jc w:val="both"/>
+        <w:rPr>
+          <w:b/>
+          <w:bCs/>
+          <w:color w:val="000000" w:themeColor="text1"/>
         </w:rPr>
       </w:pPr>
       <w:r>
@@ -16807,7 +16808,6 @@
           <w:b/>
           <w:bCs/>
           <w:color w:val="000000" w:themeColor="text1"/>
-          <w:lang w:val="en-US"/>
         </w:rPr>
       </w:pPr>
     </w:p>
@@ -16919,7 +16919,6 @@
           <w:b/>
           <w:bCs/>
           <w:color w:val="000000" w:themeColor="text1"/>
-          <w:lang w:val="en-US"/>
         </w:rPr>
       </w:pPr>
     </w:p>
@@ -17056,7 +17055,6 @@
         <w:jc w:val="both"/>
         <w:rPr>
           <w:color w:val="000000" w:themeColor="text1"/>
-          <w:lang w:val="en-US"/>
         </w:rPr>
       </w:pPr>
     </w:p>
@@ -17340,6 +17338,118 @@
           <w:bCs/>
           <w:color w:val="000000" w:themeColor="text1"/>
         </w:rPr>
+        <w:t>5.1 (Αρχιτεκτονική Συστήματος)</w:t>
+      </w:r>
+      <w:r>
+        <w:rPr>
+          <w:color w:val="000000" w:themeColor="text1"/>
+        </w:rPr>
+        <w:t>, παρουσιάζεται η συνολική τοπολογία της εφαρμογής (</w:t>
+      </w:r>
+      <w:proofErr w:type="spellStart"/>
+      <w:r>
+        <w:rPr>
+          <w:color w:val="000000" w:themeColor="text1"/>
+        </w:rPr>
+        <w:t>System</w:t>
+      </w:r>
+      <w:proofErr w:type="spellEnd"/>
+      <w:r>
+        <w:rPr>
+          <w:color w:val="000000" w:themeColor="text1"/>
+        </w:rPr>
+        <w:t xml:space="preserve"> </w:t>
+      </w:r>
+      <w:proofErr w:type="spellStart"/>
+      <w:r>
+        <w:rPr>
+          <w:color w:val="000000" w:themeColor="text1"/>
+        </w:rPr>
+        <w:t>Architecture</w:t>
+      </w:r>
+      <w:proofErr w:type="spellEnd"/>
+      <w:r>
+        <w:rPr>
+          <w:color w:val="000000" w:themeColor="text1"/>
+        </w:rPr>
+        <w:t>). Περιγράφεται ο διαχωρισμός του συστήματος παρασκηνίου (</w:t>
+      </w:r>
+      <w:proofErr w:type="spellStart"/>
+      <w:r>
+        <w:rPr>
+          <w:color w:val="000000" w:themeColor="text1"/>
+        </w:rPr>
+        <w:t>Backend</w:t>
+      </w:r>
+      <w:proofErr w:type="spellEnd"/>
+      <w:r>
+        <w:rPr>
+          <w:color w:val="000000" w:themeColor="text1"/>
+        </w:rPr>
+        <w:t xml:space="preserve"> - .NET 10) από τη </w:t>
+      </w:r>
+      <w:proofErr w:type="spellStart"/>
+      <w:r>
+        <w:rPr>
+          <w:color w:val="000000" w:themeColor="text1"/>
+        </w:rPr>
+        <w:t>διεπαφή</w:t>
+      </w:r>
+      <w:proofErr w:type="spellEnd"/>
+      <w:r>
+        <w:rPr>
+          <w:color w:val="000000" w:themeColor="text1"/>
+        </w:rPr>
+        <w:t xml:space="preserve"> χρήστη (</w:t>
+      </w:r>
+      <w:proofErr w:type="spellStart"/>
+      <w:r>
+        <w:rPr>
+          <w:color w:val="000000" w:themeColor="text1"/>
+        </w:rPr>
+        <w:t>Frontend</w:t>
+      </w:r>
+      <w:proofErr w:type="spellEnd"/>
+      <w:r>
+        <w:rPr>
+          <w:color w:val="000000" w:themeColor="text1"/>
+        </w:rPr>
+        <w:t xml:space="preserve"> - </w:t>
+      </w:r>
+      <w:proofErr w:type="spellStart"/>
+      <w:r>
+        <w:rPr>
+          <w:color w:val="000000" w:themeColor="text1"/>
+        </w:rPr>
+        <w:t>Angular</w:t>
+      </w:r>
+      <w:proofErr w:type="spellEnd"/>
+      <w:r>
+        <w:rPr>
+          <w:color w:val="000000" w:themeColor="text1"/>
+        </w:rPr>
+        <w:t xml:space="preserve"> 21) και αναλύονται τα εσωτερικά λογικά επίπεδα του API (Επίπεδο Παρουσίασης, Επιχειρησιακή Λογική, Επίπεδο Πρόσβασης Δεδομένων).</w:t>
+      </w:r>
+    </w:p>
+    <w:p>
+      <w:pPr>
+        <w:jc w:val="both"/>
+        <w:rPr>
+          <w:color w:val="000000" w:themeColor="text1"/>
+        </w:rPr>
+      </w:pPr>
+      <w:r>
+        <w:rPr>
+          <w:color w:val="000000" w:themeColor="text1"/>
+        </w:rPr>
+        <w:t xml:space="preserve">Ακολούθως, στην ενότητα </w:t>
+      </w:r>
+      <w:r>
+        <w:rPr>
+          <w:b/>
+          <w:bCs/>
+          <w:color w:val="000000" w:themeColor="text1"/>
+        </w:rPr>
         <w:t>5</w:t>
       </w:r>
       <w:r>
@@ -17348,55 +17458,336 @@
           <w:bCs/>
           <w:color w:val="000000" w:themeColor="text1"/>
         </w:rPr>
-        <w:t>.1 (Αρχιτεκτονική Συστήματος)</w:t>
-      </w:r>
-      <w:r>
-        <w:rPr>
-          <w:color w:val="000000" w:themeColor="text1"/>
-        </w:rPr>
-        <w:t>, παρουσιάζεται η συνολική τοπολογία της εφαρμογής (</w:t>
-      </w:r>
-      <w:proofErr w:type="spellStart"/>
-      <w:r>
-        <w:rPr>
-          <w:color w:val="000000" w:themeColor="text1"/>
-        </w:rPr>
+        <w:t>.2 (Σχεδιασμός Βάσης Δεδομένων)</w:t>
+      </w:r>
+      <w:r>
+        <w:rPr>
+          <w:color w:val="000000" w:themeColor="text1"/>
+        </w:rPr>
+        <w:t>, παρατίθεται ο εννοιολογικός και λογικός σχεδιασμός του θεμελίου της εφαρμογής. Παρουσιάζεται το πλήρες Διάγραμμα Οντοτήτων-Συσχετίσεων (</w:t>
+      </w:r>
+      <w:proofErr w:type="spellStart"/>
+      <w:r>
+        <w:rPr>
+          <w:color w:val="000000" w:themeColor="text1"/>
+        </w:rPr>
+        <w:t>Entity-Relationship</w:t>
+      </w:r>
+      <w:proofErr w:type="spellEnd"/>
+      <w:r>
+        <w:rPr>
+          <w:color w:val="000000" w:themeColor="text1"/>
+        </w:rPr>
+        <w:t xml:space="preserve"> </w:t>
+      </w:r>
+      <w:proofErr w:type="spellStart"/>
+      <w:r>
+        <w:rPr>
+          <w:color w:val="000000" w:themeColor="text1"/>
+        </w:rPr>
+        <w:t>Diagram</w:t>
+      </w:r>
+      <w:proofErr w:type="spellEnd"/>
+      <w:r>
+        <w:rPr>
+          <w:color w:val="000000" w:themeColor="text1"/>
+        </w:rPr>
+        <w:t xml:space="preserve"> - ERD) και επεξηγείται διεξοδικά ο τρόπος με τον οποίο οι πίνακες της </w:t>
+      </w:r>
+      <w:proofErr w:type="spellStart"/>
+      <w:r>
+        <w:rPr>
+          <w:color w:val="000000" w:themeColor="text1"/>
+        </w:rPr>
+        <w:t>PostgreSQL</w:t>
+      </w:r>
+      <w:proofErr w:type="spellEnd"/>
+      <w:r>
+        <w:rPr>
+          <w:color w:val="000000" w:themeColor="text1"/>
+        </w:rPr>
+        <w:t xml:space="preserve"> </w:t>
+      </w:r>
+      <w:proofErr w:type="spellStart"/>
+      <w:r>
+        <w:rPr>
+          <w:color w:val="000000" w:themeColor="text1"/>
+        </w:rPr>
+        <w:t>μοντελοποιήθηκαν</w:t>
+      </w:r>
+      <w:proofErr w:type="spellEnd"/>
+      <w:r>
+        <w:rPr>
+          <w:color w:val="000000" w:themeColor="text1"/>
+        </w:rPr>
+        <w:t xml:space="preserve"> ώστε να υποστηρίζουν ταυτόχρονα τη λογική </w:t>
+      </w:r>
+      <w:proofErr w:type="spellStart"/>
+      <w:r>
+        <w:rPr>
+          <w:color w:val="000000" w:themeColor="text1"/>
+        </w:rPr>
+        <w:t>TenantId</w:t>
+      </w:r>
+      <w:proofErr w:type="spellEnd"/>
+      <w:r>
+        <w:rPr>
+          <w:color w:val="000000" w:themeColor="text1"/>
+        </w:rPr>
+        <w:t xml:space="preserve"> και το υβριδικό σχήμα καταγραφής δυναμικών χαρακτηριστικών (JSONB).</w:t>
+      </w:r>
+    </w:p>
+    <w:p>
+      <w:pPr>
+        <w:spacing w:line="360" w:lineRule="auto"/>
+        <w:jc w:val="both"/>
+        <w:rPr>
+          <w:color w:val="000000" w:themeColor="text1"/>
+        </w:rPr>
+      </w:pPr>
+      <w:r>
+        <w:rPr>
+          <w:color w:val="000000" w:themeColor="text1"/>
+        </w:rPr>
+        <w:t xml:space="preserve">Στην ενότητα </w:t>
+      </w:r>
+      <w:r>
+        <w:rPr>
+          <w:b/>
+          <w:bCs/>
+          <w:color w:val="000000" w:themeColor="text1"/>
+        </w:rPr>
+        <w:t>5</w:t>
+      </w:r>
+      <w:r>
+        <w:rPr>
+          <w:b/>
+          <w:bCs/>
+          <w:color w:val="000000" w:themeColor="text1"/>
+        </w:rPr>
+        <w:t>.3 (Σχεδιασμός API)</w:t>
+      </w:r>
+      <w:r>
+        <w:rPr>
+          <w:color w:val="000000" w:themeColor="text1"/>
+        </w:rPr>
+        <w:t xml:space="preserve">, αναλύεται η αρχιτεκτονική επικοινωνίας του συστήματος. Καταγράφονται οι αρχές σχεδίασης του </w:t>
+      </w:r>
+      <w:proofErr w:type="spellStart"/>
+      <w:r>
+        <w:rPr>
+          <w:color w:val="000000" w:themeColor="text1"/>
+        </w:rPr>
+        <w:t>RESTful</w:t>
+      </w:r>
+      <w:proofErr w:type="spellEnd"/>
+      <w:r>
+        <w:rPr>
+          <w:color w:val="000000" w:themeColor="text1"/>
+        </w:rPr>
+        <w:t xml:space="preserve"> API, η ονοματολογία των διαδρομών (</w:t>
+      </w:r>
+      <w:proofErr w:type="spellStart"/>
+      <w:r>
+        <w:rPr>
+          <w:color w:val="000000" w:themeColor="text1"/>
+        </w:rPr>
+        <w:t>routes</w:t>
+      </w:r>
+      <w:proofErr w:type="spellEnd"/>
+      <w:r>
+        <w:rPr>
+          <w:color w:val="000000" w:themeColor="text1"/>
+        </w:rPr>
+        <w:t>), η χρήση των μεθόδων HTTP, καθώς και οι στρατηγικές που υιοθετήθηκαν για τη σελιδοποίηση (</w:t>
+      </w:r>
+      <w:proofErr w:type="spellStart"/>
+      <w:r>
+        <w:rPr>
+          <w:color w:val="000000" w:themeColor="text1"/>
+        </w:rPr>
+        <w:t>pagination</w:t>
+      </w:r>
+      <w:proofErr w:type="spellEnd"/>
+      <w:r>
+        <w:rPr>
+          <w:color w:val="000000" w:themeColor="text1"/>
+        </w:rPr>
+        <w:t>) και το φιλτράρισμα των δεδομένων.</w:t>
+      </w:r>
+    </w:p>
+    <w:p>
+      <w:pPr>
+        <w:jc w:val="both"/>
+        <w:rPr>
+          <w:color w:val="000000" w:themeColor="text1"/>
+        </w:rPr>
+      </w:pPr>
+      <w:r>
+        <w:rPr>
+          <w:color w:val="000000" w:themeColor="text1"/>
+        </w:rPr>
+        <w:t xml:space="preserve">Τέλος, στην ενότητα </w:t>
+      </w:r>
+      <w:r>
+        <w:rPr>
+          <w:b/>
+          <w:bCs/>
+          <w:color w:val="000000" w:themeColor="text1"/>
+        </w:rPr>
+        <w:t>5</w:t>
+      </w:r>
+      <w:r>
+        <w:rPr>
+          <w:b/>
+          <w:bCs/>
+          <w:color w:val="000000" w:themeColor="text1"/>
+        </w:rPr>
+        <w:t xml:space="preserve">.4 (Σχεδιασμός </w:t>
+      </w:r>
+      <w:proofErr w:type="spellStart"/>
+      <w:r>
+        <w:rPr>
+          <w:b/>
+          <w:bCs/>
+          <w:color w:val="000000" w:themeColor="text1"/>
+        </w:rPr>
+        <w:t>Διεπαφής</w:t>
+      </w:r>
+      <w:proofErr w:type="spellEnd"/>
+      <w:r>
+        <w:rPr>
+          <w:b/>
+          <w:bCs/>
+          <w:color w:val="000000" w:themeColor="text1"/>
+        </w:rPr>
+        <w:t xml:space="preserve"> Χρήστη - UI/UX </w:t>
+      </w:r>
+      <w:proofErr w:type="spellStart"/>
+      <w:r>
+        <w:rPr>
+          <w:b/>
+          <w:bCs/>
+          <w:color w:val="000000" w:themeColor="text1"/>
+        </w:rPr>
+        <w:t>Design</w:t>
+      </w:r>
+      <w:proofErr w:type="spellEnd"/>
+      <w:r>
+        <w:rPr>
+          <w:b/>
+          <w:bCs/>
+          <w:color w:val="000000" w:themeColor="text1"/>
+        </w:rPr>
+        <w:t>)</w:t>
+      </w:r>
+      <w:r>
+        <w:rPr>
+          <w:color w:val="000000" w:themeColor="text1"/>
+        </w:rPr>
+        <w:t>, αποτυπώνεται η σχεδιαστική φιλοσοφία της εφαρμογής πελάτη (SPA). Παρουσιάζεται ο τρόπος οργάνωσης των οθονών, η λογική πλοήγησης και η αρχιτεκτονική των δομικών στοιχείων (</w:t>
+      </w:r>
+      <w:proofErr w:type="spellStart"/>
+      <w:r>
+        <w:rPr>
+          <w:color w:val="000000" w:themeColor="text1"/>
+        </w:rPr>
+        <w:t>components</w:t>
+      </w:r>
+      <w:proofErr w:type="spellEnd"/>
+      <w:r>
+        <w:rPr>
+          <w:color w:val="000000" w:themeColor="text1"/>
+        </w:rPr>
+        <w:t xml:space="preserve">) του </w:t>
+      </w:r>
+      <w:proofErr w:type="spellStart"/>
+      <w:r>
+        <w:rPr>
+          <w:color w:val="000000" w:themeColor="text1"/>
+        </w:rPr>
+        <w:t>Angular</w:t>
+      </w:r>
+      <w:proofErr w:type="spellEnd"/>
+      <w:r>
+        <w:rPr>
+          <w:color w:val="000000" w:themeColor="text1"/>
+        </w:rPr>
+        <w:t xml:space="preserve">, διασφαλίζοντας ότι η </w:t>
+      </w:r>
+      <w:proofErr w:type="spellStart"/>
+      <w:r>
+        <w:rPr>
+          <w:color w:val="000000" w:themeColor="text1"/>
+        </w:rPr>
+        <w:t>συνθετότητα</w:t>
+      </w:r>
+      <w:proofErr w:type="spellEnd"/>
+      <w:r>
+        <w:rPr>
+          <w:color w:val="000000" w:themeColor="text1"/>
+        </w:rPr>
+        <w:t xml:space="preserve"> του παρασκηνίου μεταφράζεται σε μια ομαλή, σύγχρονη και απολύτως φιλική εμπειρία για τον τελικό χρήστη.</w:t>
+      </w:r>
+    </w:p>
+    <w:p>
+      <w:pPr>
+        <w:jc w:val="both"/>
+        <w:rPr>
+          <w:color w:val="000000" w:themeColor="text1"/>
+        </w:rPr>
+      </w:pPr>
+    </w:p>
+    <w:p>
+      <w:pPr>
+        <w:pStyle w:val="2"/>
+      </w:pPr>
+      <w:r>
+        <w:t>Αρχιτεκτονική Συστήματος (</w:t>
+      </w:r>
+      <w:proofErr w:type="spellStart"/>
+      <w:r>
         <w:t>System</w:t>
       </w:r>
       <w:proofErr w:type="spellEnd"/>
       <w:r>
-        <w:rPr>
-          <w:color w:val="000000" w:themeColor="text1"/>
-        </w:rPr>
-        <w:t xml:space="preserve"> </w:t>
-      </w:r>
-      <w:proofErr w:type="spellStart"/>
-      <w:r>
-        <w:rPr>
-          <w:color w:val="000000" w:themeColor="text1"/>
-        </w:rPr>
+        <w:t xml:space="preserve"> </w:t>
+      </w:r>
+      <w:proofErr w:type="spellStart"/>
+      <w:r>
         <w:t>Architecture</w:t>
       </w:r>
       <w:proofErr w:type="spellEnd"/>
       <w:r>
-        <w:rPr>
-          <w:color w:val="000000" w:themeColor="text1"/>
-        </w:rPr>
-        <w:t>). Περιγράφεται ο διαχωρισμός του συστήματος παρασκηνίου (</w:t>
-      </w:r>
-      <w:proofErr w:type="spellStart"/>
-      <w:r>
-        <w:rPr>
-          <w:color w:val="000000" w:themeColor="text1"/>
-        </w:rPr>
-        <w:t>Backend</w:t>
-      </w:r>
-      <w:proofErr w:type="spellEnd"/>
-      <w:r>
-        <w:rPr>
-          <w:color w:val="000000" w:themeColor="text1"/>
-        </w:rPr>
-        <w:t xml:space="preserve"> - .NET 10) από τη </w:t>
+        <w:t>)</w:t>
+      </w:r>
+    </w:p>
+    <w:p>
+      <w:pPr>
+        <w:jc w:val="both"/>
+        <w:rPr>
+          <w:color w:val="000000" w:themeColor="text1"/>
+        </w:rPr>
+      </w:pPr>
+      <w:r>
+        <w:rPr>
+          <w:color w:val="000000" w:themeColor="text1"/>
+        </w:rPr>
+        <w:t>Η αρχιτεκτονική του συστήματος ακολουθεί το κατανεμημένο πρότυπο Πελάτη-Εξυπηρετητή (</w:t>
+      </w:r>
+      <w:proofErr w:type="spellStart"/>
+      <w:r>
+        <w:rPr>
+          <w:color w:val="000000" w:themeColor="text1"/>
+        </w:rPr>
+        <w:t>Client</w:t>
+      </w:r>
+      <w:proofErr w:type="spellEnd"/>
+      <w:r>
+        <w:rPr>
+          <w:color w:val="000000" w:themeColor="text1"/>
+        </w:rPr>
+        <w:t xml:space="preserve">-Server), διαχωρίζοντας πλήρως την οπτική </w:t>
       </w:r>
       <w:proofErr w:type="spellStart"/>
       <w:r>
@@ -17410,488 +17801,87 @@
         <w:rPr>
           <w:color w:val="000000" w:themeColor="text1"/>
         </w:rPr>
-        <w:t xml:space="preserve"> χρήστη (</w:t>
-      </w:r>
-      <w:proofErr w:type="spellStart"/>
-      <w:r>
-        <w:rPr>
-          <w:color w:val="000000" w:themeColor="text1"/>
-        </w:rPr>
-        <w:t>Frontend</w:t>
-      </w:r>
-      <w:proofErr w:type="spellEnd"/>
-      <w:r>
-        <w:rPr>
-          <w:color w:val="000000" w:themeColor="text1"/>
-        </w:rPr>
-        <w:t xml:space="preserve"> - </w:t>
-      </w:r>
-      <w:proofErr w:type="spellStart"/>
-      <w:r>
-        <w:rPr>
-          <w:color w:val="000000" w:themeColor="text1"/>
-        </w:rPr>
-        <w:t>Angular</w:t>
-      </w:r>
-      <w:proofErr w:type="spellEnd"/>
-      <w:r>
-        <w:rPr>
-          <w:color w:val="000000" w:themeColor="text1"/>
-        </w:rPr>
-        <w:t xml:space="preserve"> 21) και αναλύονται τα εσωτερικά λογικά επίπεδα του API (Επίπεδο Παρουσίασης, Επιχειρησιακή Λογική, Επίπεδο Πρόσβασης Δεδομένων).</w:t>
-      </w:r>
-    </w:p>
-    <w:p>
-      <w:pPr>
-        <w:jc w:val="both"/>
-        <w:rPr>
-          <w:color w:val="000000" w:themeColor="text1"/>
-        </w:rPr>
-      </w:pPr>
-      <w:r>
-        <w:rPr>
-          <w:color w:val="000000" w:themeColor="text1"/>
-        </w:rPr>
-        <w:t xml:space="preserve">Ακολούθως, στην ενότητα </w:t>
-      </w:r>
-      <w:r>
-        <w:rPr>
-          <w:b/>
-          <w:bCs/>
-          <w:color w:val="000000" w:themeColor="text1"/>
-        </w:rPr>
-        <w:t>5</w:t>
-      </w:r>
-      <w:r>
-        <w:rPr>
-          <w:b/>
-          <w:bCs/>
-          <w:color w:val="000000" w:themeColor="text1"/>
-        </w:rPr>
-        <w:t>.2 (Σχεδιασμός Βάσης Δεδομένων)</w:t>
-      </w:r>
-      <w:r>
-        <w:rPr>
-          <w:color w:val="000000" w:themeColor="text1"/>
-        </w:rPr>
-        <w:t>, παρατίθεται ο εννοιολογικός και λογικός σχεδιασμός του θεμελίου της εφαρμογής. Παρουσιάζεται το πλήρες Διάγραμμα Οντοτήτων-Συσχετίσεων (</w:t>
-      </w:r>
-      <w:proofErr w:type="spellStart"/>
-      <w:r>
-        <w:rPr>
-          <w:color w:val="000000" w:themeColor="text1"/>
-        </w:rPr>
-        <w:t>Entity-Relationship</w:t>
-      </w:r>
-      <w:proofErr w:type="spellEnd"/>
-      <w:r>
-        <w:rPr>
-          <w:color w:val="000000" w:themeColor="text1"/>
-        </w:rPr>
-        <w:t xml:space="preserve"> </w:t>
-      </w:r>
-      <w:proofErr w:type="spellStart"/>
-      <w:r>
-        <w:rPr>
-          <w:color w:val="000000" w:themeColor="text1"/>
-        </w:rPr>
-        <w:t>Diagram</w:t>
-      </w:r>
-      <w:proofErr w:type="spellEnd"/>
-      <w:r>
-        <w:rPr>
-          <w:color w:val="000000" w:themeColor="text1"/>
-        </w:rPr>
-        <w:t xml:space="preserve"> - ERD) και επεξηγείται διεξοδικά ο τρόπος με τον οποίο οι πίνακες της </w:t>
-      </w:r>
-      <w:proofErr w:type="spellStart"/>
-      <w:r>
-        <w:rPr>
-          <w:color w:val="000000" w:themeColor="text1"/>
-        </w:rPr>
-        <w:t>PostgreSQL</w:t>
-      </w:r>
-      <w:proofErr w:type="spellEnd"/>
-      <w:r>
-        <w:rPr>
-          <w:color w:val="000000" w:themeColor="text1"/>
-        </w:rPr>
-        <w:t xml:space="preserve"> </w:t>
-      </w:r>
-      <w:proofErr w:type="spellStart"/>
-      <w:r>
-        <w:rPr>
-          <w:color w:val="000000" w:themeColor="text1"/>
-        </w:rPr>
-        <w:t>μοντελοποιήθηκαν</w:t>
-      </w:r>
-      <w:proofErr w:type="spellEnd"/>
-      <w:r>
-        <w:rPr>
-          <w:color w:val="000000" w:themeColor="text1"/>
-        </w:rPr>
-        <w:t xml:space="preserve"> ώστε να υποστηρίζουν ταυτόχρονα τη λογική </w:t>
-      </w:r>
-      <w:proofErr w:type="spellStart"/>
-      <w:r>
-        <w:rPr>
-          <w:color w:val="000000" w:themeColor="text1"/>
-        </w:rPr>
-        <w:t>TenantId</w:t>
-      </w:r>
-      <w:proofErr w:type="spellEnd"/>
-      <w:r>
-        <w:rPr>
-          <w:color w:val="000000" w:themeColor="text1"/>
-        </w:rPr>
-        <w:t xml:space="preserve"> και το υβριδικό σχήμα καταγραφής δυναμικών χαρακτηριστικών (JSONB).</w:t>
-      </w:r>
-    </w:p>
-    <w:p>
-      <w:pPr>
-        <w:spacing w:line="360" w:lineRule="auto"/>
-        <w:jc w:val="both"/>
-        <w:rPr>
-          <w:color w:val="000000" w:themeColor="text1"/>
-        </w:rPr>
-      </w:pPr>
-      <w:r>
-        <w:rPr>
-          <w:color w:val="000000" w:themeColor="text1"/>
-        </w:rPr>
-        <w:t xml:space="preserve">Στην ενότητα </w:t>
-      </w:r>
-      <w:r>
-        <w:rPr>
-          <w:b/>
-          <w:bCs/>
-          <w:color w:val="000000" w:themeColor="text1"/>
-        </w:rPr>
-        <w:t>5</w:t>
-      </w:r>
-      <w:r>
-        <w:rPr>
-          <w:b/>
-          <w:bCs/>
-          <w:color w:val="000000" w:themeColor="text1"/>
-        </w:rPr>
-        <w:t>.3 (Σχεδιασμός API)</w:t>
-      </w:r>
-      <w:r>
-        <w:rPr>
-          <w:color w:val="000000" w:themeColor="text1"/>
-        </w:rPr>
-        <w:t xml:space="preserve">, αναλύεται η αρχιτεκτονική επικοινωνίας του συστήματος. Καταγράφονται οι αρχές σχεδίασης του </w:t>
-      </w:r>
-      <w:proofErr w:type="spellStart"/>
-      <w:r>
-        <w:rPr>
-          <w:color w:val="000000" w:themeColor="text1"/>
-        </w:rPr>
-        <w:t>RESTful</w:t>
-      </w:r>
-      <w:proofErr w:type="spellEnd"/>
-      <w:r>
-        <w:rPr>
-          <w:color w:val="000000" w:themeColor="text1"/>
-        </w:rPr>
-        <w:t xml:space="preserve"> API, η ονοματολογία των διαδρομών (</w:t>
-      </w:r>
-      <w:proofErr w:type="spellStart"/>
-      <w:r>
-        <w:rPr>
-          <w:color w:val="000000" w:themeColor="text1"/>
-        </w:rPr>
-        <w:t>routes</w:t>
-      </w:r>
-      <w:proofErr w:type="spellEnd"/>
-      <w:r>
-        <w:rPr>
-          <w:color w:val="000000" w:themeColor="text1"/>
-        </w:rPr>
-        <w:t>), η χρήση των μεθόδων HTTP, καθώς και οι στρατηγικές που υιοθετήθηκαν για τη σελιδοποίηση (</w:t>
-      </w:r>
-      <w:proofErr w:type="spellStart"/>
-      <w:r>
-        <w:rPr>
-          <w:color w:val="000000" w:themeColor="text1"/>
-        </w:rPr>
-        <w:t>pagination</w:t>
-      </w:r>
-      <w:proofErr w:type="spellEnd"/>
-      <w:r>
-        <w:rPr>
-          <w:color w:val="000000" w:themeColor="text1"/>
-        </w:rPr>
-        <w:t>) και το φιλτράρισμα των δεδομένων.</w:t>
-      </w:r>
-    </w:p>
-    <w:p>
-      <w:pPr>
-        <w:jc w:val="both"/>
-        <w:rPr>
-          <w:color w:val="000000" w:themeColor="text1"/>
-        </w:rPr>
-      </w:pPr>
-      <w:r>
-        <w:rPr>
-          <w:color w:val="000000" w:themeColor="text1"/>
-        </w:rPr>
-        <w:t xml:space="preserve">Τέλος, στην ενότητα </w:t>
-      </w:r>
-      <w:r>
-        <w:rPr>
-          <w:b/>
-          <w:bCs/>
-          <w:color w:val="000000" w:themeColor="text1"/>
-        </w:rPr>
-        <w:t>5</w:t>
-      </w:r>
-      <w:r>
-        <w:rPr>
-          <w:b/>
-          <w:bCs/>
-          <w:color w:val="000000" w:themeColor="text1"/>
-        </w:rPr>
-        <w:t xml:space="preserve">.4 (Σχεδιασμός </w:t>
-      </w:r>
-      <w:proofErr w:type="spellStart"/>
-      <w:r>
-        <w:rPr>
-          <w:b/>
-          <w:bCs/>
-          <w:color w:val="000000" w:themeColor="text1"/>
-        </w:rPr>
-        <w:t>Διεπαφής</w:t>
-      </w:r>
-      <w:proofErr w:type="spellEnd"/>
-      <w:r>
-        <w:rPr>
-          <w:b/>
-          <w:bCs/>
-          <w:color w:val="000000" w:themeColor="text1"/>
-        </w:rPr>
-        <w:t xml:space="preserve"> Χρήστη - UI/UX </w:t>
-      </w:r>
-      <w:proofErr w:type="spellStart"/>
-      <w:r>
-        <w:rPr>
-          <w:b/>
-          <w:bCs/>
-          <w:color w:val="000000" w:themeColor="text1"/>
-        </w:rPr>
-        <w:t>Design</w:t>
-      </w:r>
-      <w:proofErr w:type="spellEnd"/>
-      <w:r>
-        <w:rPr>
-          <w:b/>
-          <w:bCs/>
-          <w:color w:val="000000" w:themeColor="text1"/>
-        </w:rPr>
-        <w:t>)</w:t>
-      </w:r>
-      <w:r>
-        <w:rPr>
-          <w:color w:val="000000" w:themeColor="text1"/>
-        </w:rPr>
-        <w:t>, αποτυπώνεται η σχεδιαστική φιλοσοφία της εφαρμογής πελάτη (SPA). Παρουσιάζεται ο τρόπος οργάνωσης των οθονών, η λογική πλοήγησης και η αρχιτεκτονική των δομικών στοιχείων (</w:t>
-      </w:r>
-      <w:proofErr w:type="spellStart"/>
-      <w:r>
-        <w:rPr>
-          <w:color w:val="000000" w:themeColor="text1"/>
-        </w:rPr>
-        <w:t>components</w:t>
-      </w:r>
-      <w:proofErr w:type="spellEnd"/>
-      <w:r>
-        <w:rPr>
-          <w:color w:val="000000" w:themeColor="text1"/>
-        </w:rPr>
-        <w:t xml:space="preserve">) του </w:t>
-      </w:r>
-      <w:proofErr w:type="spellStart"/>
-      <w:r>
-        <w:rPr>
-          <w:color w:val="000000" w:themeColor="text1"/>
-        </w:rPr>
-        <w:t>Angular</w:t>
-      </w:r>
-      <w:proofErr w:type="spellEnd"/>
-      <w:r>
-        <w:rPr>
-          <w:color w:val="000000" w:themeColor="text1"/>
-        </w:rPr>
-        <w:t xml:space="preserve">, διασφαλίζοντας ότι η </w:t>
-      </w:r>
-      <w:proofErr w:type="spellStart"/>
-      <w:r>
-        <w:rPr>
-          <w:color w:val="000000" w:themeColor="text1"/>
-        </w:rPr>
-        <w:t>συνθετότητα</w:t>
-      </w:r>
-      <w:proofErr w:type="spellEnd"/>
-      <w:r>
-        <w:rPr>
-          <w:color w:val="000000" w:themeColor="text1"/>
-        </w:rPr>
-        <w:t xml:space="preserve"> του παρασκηνίου μεταφράζεται σε μια ομαλή, σύγχρονη και απολύτως φιλική εμπειρία για τον τελικό χρήστη.</w:t>
-      </w:r>
-    </w:p>
-    <w:p>
-      <w:pPr>
-        <w:jc w:val="both"/>
-        <w:rPr>
-          <w:color w:val="000000" w:themeColor="text1"/>
-        </w:rPr>
-      </w:pPr>
-    </w:p>
-    <w:p>
-      <w:pPr>
-        <w:pStyle w:val="2"/>
-      </w:pPr>
-      <w:r>
-        <w:t>Αρχιτεκτονική Συστήματος (</w:t>
-      </w:r>
-      <w:proofErr w:type="spellStart"/>
-      <w:r>
-        <w:t>System</w:t>
-      </w:r>
-      <w:proofErr w:type="spellEnd"/>
-      <w:r>
-        <w:t xml:space="preserve"> </w:t>
-      </w:r>
-      <w:proofErr w:type="spellStart"/>
-      <w:r>
+        <w:t xml:space="preserve"> χρήστη από τη λειτουργική λογική του παρασκηνίου. Η προσέγγιση αυτή εξασφαλίζει υψηλή </w:t>
+      </w:r>
+      <w:proofErr w:type="spellStart"/>
+      <w:r>
+        <w:rPr>
+          <w:color w:val="000000" w:themeColor="text1"/>
+        </w:rPr>
+        <w:t>σπονδυλωτότητα</w:t>
+      </w:r>
+      <w:proofErr w:type="spellEnd"/>
+      <w:r>
+        <w:rPr>
+          <w:color w:val="000000" w:themeColor="text1"/>
+        </w:rPr>
+        <w:t xml:space="preserve"> (</w:t>
+      </w:r>
+      <w:proofErr w:type="spellStart"/>
+      <w:r>
+        <w:rPr>
+          <w:color w:val="000000" w:themeColor="text1"/>
+        </w:rPr>
+        <w:t>modularity</w:t>
+      </w:r>
+      <w:proofErr w:type="spellEnd"/>
+      <w:r>
+        <w:rPr>
+          <w:color w:val="000000" w:themeColor="text1"/>
+        </w:rPr>
+        <w:t>), διευκολύνει την ανεξάρτητη ανάπτυξη και συντήρηση των επιμέρους τμημάτων και επιτρέπει τη μελλοντική και ανεξάρτητη κλιμάκωση (</w:t>
+      </w:r>
+      <w:proofErr w:type="spellStart"/>
+      <w:r>
+        <w:rPr>
+          <w:color w:val="000000" w:themeColor="text1"/>
+        </w:rPr>
+        <w:t>scalability</w:t>
+      </w:r>
+      <w:proofErr w:type="spellEnd"/>
+      <w:r>
+        <w:rPr>
+          <w:color w:val="000000" w:themeColor="text1"/>
+        </w:rPr>
+        <w:t>) του συστήματος στο υπολογιστικό νέφος.</w:t>
+      </w:r>
+    </w:p>
+    <w:p>
+      <w:pPr>
+        <w:jc w:val="both"/>
+        <w:rPr>
+          <w:color w:val="000000" w:themeColor="text1"/>
+        </w:rPr>
+      </w:pPr>
+      <w:r>
+        <w:rPr>
+          <w:color w:val="000000" w:themeColor="text1"/>
+        </w:rPr>
+        <w:t>Το σύστημα δομείται σε τρία διακριτά και αυτόνομα επίπεδα (N-</w:t>
+      </w:r>
+      <w:proofErr w:type="spellStart"/>
+      <w:r>
+        <w:rPr>
+          <w:color w:val="000000" w:themeColor="text1"/>
+        </w:rPr>
+        <w:t>Tier</w:t>
+      </w:r>
+      <w:proofErr w:type="spellEnd"/>
+      <w:r>
+        <w:rPr>
+          <w:color w:val="000000" w:themeColor="text1"/>
+        </w:rPr>
+        <w:t xml:space="preserve"> </w:t>
+      </w:r>
+      <w:proofErr w:type="spellStart"/>
+      <w:r>
+        <w:rPr>
+          <w:color w:val="000000" w:themeColor="text1"/>
+        </w:rPr>
         <w:t>Architecture</w:t>
       </w:r>
       <w:proofErr w:type="spellEnd"/>
       <w:r>
-        <w:t>)</w:t>
-      </w:r>
-    </w:p>
-    <w:p>
-      <w:pPr>
-        <w:jc w:val="both"/>
-        <w:rPr>
-          <w:color w:val="000000" w:themeColor="text1"/>
-        </w:rPr>
-      </w:pPr>
-      <w:r>
-        <w:rPr>
-          <w:color w:val="000000" w:themeColor="text1"/>
-        </w:rPr>
-        <w:t>Η αρχιτεκτονική του συστήματος ακολουθεί το κατανεμημένο πρότυπο Πελάτη-Εξυπηρετητή (</w:t>
-      </w:r>
-      <w:proofErr w:type="spellStart"/>
-      <w:r>
-        <w:rPr>
-          <w:color w:val="000000" w:themeColor="text1"/>
-        </w:rPr>
-        <w:t>Client</w:t>
-      </w:r>
-      <w:proofErr w:type="spellEnd"/>
-      <w:r>
-        <w:rPr>
-          <w:color w:val="000000" w:themeColor="text1"/>
-        </w:rPr>
-        <w:t xml:space="preserve">-Server), διαχωρίζοντας πλήρως την οπτική </w:t>
-      </w:r>
-      <w:proofErr w:type="spellStart"/>
-      <w:r>
-        <w:rPr>
-          <w:color w:val="000000" w:themeColor="text1"/>
-        </w:rPr>
-        <w:t>διεπαφή</w:t>
-      </w:r>
-      <w:proofErr w:type="spellEnd"/>
-      <w:r>
-        <w:rPr>
-          <w:color w:val="000000" w:themeColor="text1"/>
-        </w:rPr>
-        <w:t xml:space="preserve"> χρήστη από τη λειτουργική λογική του παρασκηνίου. Η προσέγγιση αυτή εξασφαλίζει υψηλή </w:t>
-      </w:r>
-      <w:proofErr w:type="spellStart"/>
-      <w:r>
-        <w:rPr>
-          <w:color w:val="000000" w:themeColor="text1"/>
-        </w:rPr>
-        <w:t>σπονδυλωτότητα</w:t>
-      </w:r>
-      <w:proofErr w:type="spellEnd"/>
-      <w:r>
-        <w:rPr>
-          <w:color w:val="000000" w:themeColor="text1"/>
-        </w:rPr>
-        <w:t xml:space="preserve"> (</w:t>
-      </w:r>
-      <w:proofErr w:type="spellStart"/>
-      <w:r>
-        <w:rPr>
-          <w:color w:val="000000" w:themeColor="text1"/>
-        </w:rPr>
-        <w:t>modularity</w:t>
-      </w:r>
-      <w:proofErr w:type="spellEnd"/>
-      <w:r>
-        <w:rPr>
-          <w:color w:val="000000" w:themeColor="text1"/>
-        </w:rPr>
-        <w:t>), διευκολύνει την ανεξάρτητη ανάπτυξη και συντήρηση των επιμέρους τμημάτων και επιτρέπει τη μελλοντική και ανεξάρτητη κλιμάκωση (</w:t>
-      </w:r>
-      <w:proofErr w:type="spellStart"/>
-      <w:r>
-        <w:rPr>
-          <w:color w:val="000000" w:themeColor="text1"/>
-        </w:rPr>
-        <w:t>scalability</w:t>
-      </w:r>
-      <w:proofErr w:type="spellEnd"/>
-      <w:r>
-        <w:rPr>
-          <w:color w:val="000000" w:themeColor="text1"/>
-        </w:rPr>
-        <w:t>) του συστήματος στο υπολογιστικό νέφος.</w:t>
-      </w:r>
-    </w:p>
-    <w:p>
-      <w:pPr>
-        <w:jc w:val="both"/>
-        <w:rPr>
-          <w:color w:val="000000" w:themeColor="text1"/>
-        </w:rPr>
-      </w:pPr>
-      <w:r>
-        <w:rPr>
-          <w:color w:val="000000" w:themeColor="text1"/>
-        </w:rPr>
-        <w:t>Το σύστημα δομείται σε τρία διακριτά και αυτόνομα επίπεδα (N-</w:t>
-      </w:r>
-      <w:proofErr w:type="spellStart"/>
-      <w:r>
-        <w:rPr>
-          <w:color w:val="000000" w:themeColor="text1"/>
-        </w:rPr>
-        <w:t>Tier</w:t>
-      </w:r>
-      <w:proofErr w:type="spellEnd"/>
-      <w:r>
-        <w:rPr>
-          <w:color w:val="000000" w:themeColor="text1"/>
-        </w:rPr>
-        <w:t xml:space="preserve"> </w:t>
-      </w:r>
-      <w:proofErr w:type="spellStart"/>
-      <w:r>
-        <w:rPr>
-          <w:color w:val="000000" w:themeColor="text1"/>
-        </w:rPr>
-        <w:t>Architecture</w:t>
-      </w:r>
-      <w:proofErr w:type="spellEnd"/>
-      <w:r>
         <w:rPr>
           <w:color w:val="000000" w:themeColor="text1"/>
         </w:rPr>
@@ -17915,48 +17905,49 @@
     <w:p>
       <w:pPr>
         <w:pStyle w:val="3"/>
+        <w:rPr>
+          <w:lang w:val="en-US"/>
+        </w:rPr>
       </w:pPr>
       <w:r>
         <w:lastRenderedPageBreak/>
-        <w:t>Επίπεδο Παρουσίασης (</w:t>
-      </w:r>
-      <w:proofErr w:type="spellStart"/>
-      <w:r>
-        <w:t>Presentation</w:t>
-      </w:r>
-      <w:proofErr w:type="spellEnd"/>
-      <w:r>
-        <w:t xml:space="preserve"> </w:t>
-      </w:r>
-      <w:proofErr w:type="spellStart"/>
-      <w:r>
-        <w:t>Layer</w:t>
-      </w:r>
-      <w:proofErr w:type="spellEnd"/>
-      <w:r>
-        <w:t xml:space="preserve"> / </w:t>
-      </w:r>
-      <w:proofErr w:type="spellStart"/>
-      <w:r>
-        <w:t>Frontend</w:t>
-      </w:r>
-      <w:proofErr w:type="spellEnd"/>
-      <w:r>
-        <w:t>)</w:t>
-      </w:r>
-    </w:p>
-    <w:p>
-      <w:pPr>
-        <w:jc w:val="both"/>
-        <w:rPr>
-          <w:color w:val="000000" w:themeColor="text1"/>
-        </w:rPr>
-      </w:pPr>
-      <w:r>
-        <w:rPr>
-          <w:color w:val="000000" w:themeColor="text1"/>
-        </w:rPr>
-        <w:t xml:space="preserve"> Το ανώτερο επίπεδο υλοποιείται ως μια Εφαρμογή Ενιαίας Σελίδας (</w:t>
+        <w:t>Επίπεδο</w:t>
+      </w:r>
+      <w:r>
+        <w:rPr>
+          <w:lang w:val="en-US"/>
+        </w:rPr>
+        <w:t xml:space="preserve"> </w:t>
+      </w:r>
+      <w:r>
+        <w:t>Παρουσίασης</w:t>
+      </w:r>
+      <w:r>
+        <w:rPr>
+          <w:lang w:val="en-US"/>
+        </w:rPr>
+        <w:t xml:space="preserve"> (Presentation Layer / Frontend)</w:t>
+      </w:r>
+    </w:p>
+    <w:p>
+      <w:pPr>
+        <w:jc w:val="both"/>
+        <w:rPr>
+          <w:color w:val="000000" w:themeColor="text1"/>
+        </w:rPr>
+      </w:pPr>
+      <w:r>
+        <w:rPr>
+          <w:color w:val="000000" w:themeColor="text1"/>
+          <w:lang w:val="en-US"/>
+        </w:rPr>
+        <w:t xml:space="preserve"> </w:t>
+      </w:r>
+      <w:r>
+        <w:rPr>
+          <w:color w:val="000000" w:themeColor="text1"/>
+        </w:rPr>
+        <w:t>Το ανώτερο επίπεδο υλοποιείται ως μια Εφαρμογή Ενιαίας Σελίδας (</w:t>
       </w:r>
       <w:proofErr w:type="spellStart"/>
       <w:r>
@@ -18972,12 +18963,225 @@
     </w:p>
     <w:p>
       <w:pPr>
-        <w:jc w:val="both"/>
-        <w:rPr>
+        <w:rPr>
+          <w:color w:val="000000" w:themeColor="text1"/>
+        </w:rPr>
+      </w:pPr>
+      <w:r>
+        <w:rPr>
+          <w:color w:val="000000" w:themeColor="text1"/>
+        </w:rPr>
+        <w:br w:type="page"/>
+      </w:r>
+    </w:p>
+    <w:p>
+      <w:pPr>
+        <w:rPr>
+          <w:color w:val="000000" w:themeColor="text1"/>
+        </w:rPr>
+      </w:pPr>
+      <w:r>
+        <w:rPr>
+          <w:color w:val="000000" w:themeColor="text1"/>
+        </w:rPr>
+        <w:lastRenderedPageBreak/>
+        <w:br w:type="page"/>
+      </w:r>
+    </w:p>
+    <w:p>
+      <w:pPr>
+        <w:jc w:val="both"/>
+        <w:rPr>
+          <w:b/>
+          <w:bCs/>
           <w:color w:val="000000" w:themeColor="text1"/>
           <w:lang w:val="en-US"/>
         </w:rPr>
       </w:pPr>
+      <w:r>
+        <w:rPr>
+          <w:b/>
+          <w:bCs/>
+          <w:color w:val="000000" w:themeColor="text1"/>
+          <w:highlight w:val="yellow"/>
+          <w:lang w:val="en-US"/>
+        </w:rPr>
+        <w:lastRenderedPageBreak/>
+        <w:t>Refresh token</w:t>
+      </w:r>
+    </w:p>
+    <w:p>
+      <w:pPr>
+        <w:jc w:val="both"/>
+        <w:rPr>
+          <w:color w:val="000000" w:themeColor="text1"/>
+          <w:lang w:val="en-US"/>
+        </w:rPr>
+      </w:pPr>
+      <w:r>
+        <w:rPr>
+          <w:color w:val="000000" w:themeColor="text1"/>
+        </w:rPr>
+        <w:t xml:space="preserve">ένα </w:t>
+      </w:r>
+      <w:proofErr w:type="spellStart"/>
+      <w:r>
+        <w:rPr>
+          <w:b/>
+          <w:bCs/>
+          <w:color w:val="000000" w:themeColor="text1"/>
+        </w:rPr>
+        <w:t>Angular</w:t>
+      </w:r>
+      <w:proofErr w:type="spellEnd"/>
+      <w:r>
+        <w:rPr>
+          <w:b/>
+          <w:bCs/>
+          <w:color w:val="000000" w:themeColor="text1"/>
+        </w:rPr>
+        <w:t xml:space="preserve"> HTTP </w:t>
+      </w:r>
+      <w:proofErr w:type="spellStart"/>
+      <w:r>
+        <w:rPr>
+          <w:b/>
+          <w:bCs/>
+          <w:color w:val="000000" w:themeColor="text1"/>
+        </w:rPr>
+        <w:t>Interceptor</w:t>
+      </w:r>
+      <w:proofErr w:type="spellEnd"/>
+      <w:r>
+        <w:rPr>
+          <w:color w:val="000000" w:themeColor="text1"/>
+        </w:rPr>
+        <w:t xml:space="preserve"> που προσθέτει αυτόματα το JWT </w:t>
+      </w:r>
+      <w:proofErr w:type="spellStart"/>
+      <w:r>
+        <w:rPr>
+          <w:color w:val="000000" w:themeColor="text1"/>
+        </w:rPr>
+        <w:t>token</w:t>
+      </w:r>
+      <w:proofErr w:type="spellEnd"/>
+      <w:r>
+        <w:rPr>
+          <w:color w:val="000000" w:themeColor="text1"/>
+        </w:rPr>
+        <w:t xml:space="preserve"> σε κάθε </w:t>
+      </w:r>
+      <w:proofErr w:type="spellStart"/>
+      <w:r>
+        <w:rPr>
+          <w:color w:val="000000" w:themeColor="text1"/>
+        </w:rPr>
+        <w:t>request</w:t>
+      </w:r>
+      <w:proofErr w:type="spellEnd"/>
+      <w:r>
+        <w:rPr>
+          <w:color w:val="000000" w:themeColor="text1"/>
+        </w:rPr>
+        <w:t xml:space="preserve"> και, αν το </w:t>
+      </w:r>
+      <w:proofErr w:type="spellStart"/>
+      <w:r>
+        <w:rPr>
+          <w:color w:val="000000" w:themeColor="text1"/>
+        </w:rPr>
+        <w:t>token</w:t>
+      </w:r>
+      <w:proofErr w:type="spellEnd"/>
+      <w:r>
+        <w:rPr>
+          <w:color w:val="000000" w:themeColor="text1"/>
+        </w:rPr>
+        <w:t xml:space="preserve"> έχει λήξει, προσπαθεί να το ανανεώσει (</w:t>
+      </w:r>
+      <w:proofErr w:type="spellStart"/>
+      <w:r>
+        <w:rPr>
+          <w:color w:val="000000" w:themeColor="text1"/>
+        </w:rPr>
+        <w:t>refresh</w:t>
+      </w:r>
+      <w:proofErr w:type="spellEnd"/>
+      <w:r>
+        <w:rPr>
+          <w:color w:val="000000" w:themeColor="text1"/>
+        </w:rPr>
+        <w:t xml:space="preserve"> </w:t>
+      </w:r>
+      <w:proofErr w:type="spellStart"/>
+      <w:r>
+        <w:rPr>
+          <w:color w:val="000000" w:themeColor="text1"/>
+        </w:rPr>
+        <w:t>token</w:t>
+      </w:r>
+      <w:proofErr w:type="spellEnd"/>
+      <w:r>
+        <w:rPr>
+          <w:color w:val="000000" w:themeColor="text1"/>
+        </w:rPr>
+        <w:t>) χωρίς να το καταλάβει ο χρήστης.</w:t>
+      </w:r>
+    </w:p>
+    <w:p>
+      <w:pPr>
+        <w:jc w:val="both"/>
+        <w:rPr>
+          <w:color w:val="000000" w:themeColor="text1"/>
+        </w:rPr>
+      </w:pPr>
+      <w:r>
+        <w:rPr>
+          <w:noProof/>
+        </w:rPr>
+        <w:t xml:space="preserve"> </w:t>
+      </w:r>
+      <w:r>
+        <w:rPr>
+          <w:color w:val="000000" w:themeColor="text1"/>
+        </w:rPr>
+        <w:drawing>
+          <wp:inline distT="0" distB="0" distL="0" distR="0" wp14:anchorId="6E08D238" wp14:editId="46AA00F1">
+            <wp:extent cx="3438525" cy="7464464"/>
+            <wp:effectExtent l="0" t="0" r="0" b="3175"/>
+            <wp:docPr id="1793943195" name="Εικόνα 1"/>
+            <wp:cNvGraphicFramePr>
+              <a:graphicFrameLocks xmlns:a="http://schemas.openxmlformats.org/drawingml/2006/main" noChangeAspect="1"/>
+            </wp:cNvGraphicFramePr>
+            <a:graphic xmlns:a="http://schemas.openxmlformats.org/drawingml/2006/main">
+              <a:graphicData uri="http://schemas.openxmlformats.org/drawingml/2006/picture">
+                <pic:pic xmlns:pic="http://schemas.openxmlformats.org/drawingml/2006/picture">
+                  <pic:nvPicPr>
+                    <pic:cNvPr id="1793943195" name=""/>
+                    <pic:cNvPicPr/>
+                  </pic:nvPicPr>
+                  <pic:blipFill>
+                    <a:blip r:embed="rId8"/>
+                    <a:stretch>
+                      <a:fillRect/>
+                    </a:stretch>
+                  </pic:blipFill>
+                  <pic:spPr>
+                    <a:xfrm>
+                      <a:off x="0" y="0"/>
+                      <a:ext cx="3442508" cy="7473110"/>
+                    </a:xfrm>
+                    <a:prstGeom prst="rect">
+                      <a:avLst/>
+                    </a:prstGeom>
+                  </pic:spPr>
+                </pic:pic>
+              </a:graphicData>
+            </a:graphic>
+          </wp:inline>
+        </w:drawing>
+      </w:r>
     </w:p>
     <w:sectPr>
       <w:pgSz w:w="11906" w:h="16838"/>

</xml_diff>

<commit_message>
feat: add QR code scanning and generation features - Added QR code generation component for assets with download and print options. - Implemented QR code scanner using ZXing library for scanning asset QR codes. - Updated asset detail view to include QR code display.
</commit_message>
<xml_diff>
--- a/πτυχιακη.docx
+++ b/πτυχιακη.docx
@@ -19133,7 +19133,7 @@
       <w:pPr>
         <w:jc w:val="both"/>
         <w:rPr>
-          <w:color w:val="000000" w:themeColor="text1"/>
+          <w:noProof/>
         </w:rPr>
       </w:pPr>
       <w:r>
@@ -19183,6 +19183,752 @@
         </w:drawing>
       </w:r>
     </w:p>
+    <w:p>
+      <w:pPr>
+        <w:jc w:val="both"/>
+        <w:rPr>
+          <w:noProof/>
+          <w:lang w:val="en-US"/>
+        </w:rPr>
+      </w:pPr>
+    </w:p>
+    <w:p>
+      <w:pPr>
+        <w:pStyle w:val="10"/>
+        <w:rPr>
+          <w:noProof/>
+        </w:rPr>
+      </w:pPr>
+      <w:r>
+        <w:rPr>
+          <w:noProof/>
+        </w:rPr>
+        <w:lastRenderedPageBreak/>
+        <w:t>Audit Logs</w:t>
+      </w:r>
+    </w:p>
+    <w:p>
+      <w:pPr>
+        <w:jc w:val="both"/>
+        <w:rPr>
+          <w:noProof/>
+        </w:rPr>
+      </w:pPr>
+      <w:r>
+        <w:rPr>
+          <w:noProof/>
+        </w:rPr>
+        <w:t>Για την καταγραφή όλων των κρίσιμων ενεργειών της εφαρμογής (δημιουργία, τροποποίηση και διαγραφή οντοτήτων) υλοποιήθηκε ένας μηχανισμός Audit Logging, ο οποίος διατηρεί ιστορικό αλλαγών στη βάση δεδομένων. Στόχος της υλοποίησης είναι η πλήρης ιχνηλασιμότητα των ενεργειών των χρηστών, χωρίς όμως να επιβαρύνεται η απόδοση του συστήματος.</w:t>
+      </w:r>
+    </w:p>
+    <w:p>
+      <w:pPr>
+        <w:jc w:val="both"/>
+        <w:rPr>
+          <w:noProof/>
+        </w:rPr>
+      </w:pPr>
+      <w:r>
+        <w:rPr>
+          <w:noProof/>
+        </w:rPr>
+        <w:t>Σε ένα πολυχρήστη σύστημα, κάθε αποθήκευση δεδομένων θα μπορούσε να απαιτεί δύο ξεχωριστές εγγραφές στη βάση: μία στον κύριο πίνακα της οντότητας και μία στον πίνακα AuditLogs. Αν οι δύο αυτές εγγραφές εκτελούνταν συγχρονισμένα (synchronously) μέσα στο ίδιο HTTP request, ο χρόνος απόκρισης του API θα αυξανόταν σημαντικά, καθώς κάθε αίτημα θα περίμενε την ολοκλήρωση και των δύο εγγραφών.</w:t>
+      </w:r>
+    </w:p>
+    <w:p>
+      <w:pPr>
+        <w:jc w:val="both"/>
+        <w:rPr>
+          <w:noProof/>
+        </w:rPr>
+      </w:pPr>
+      <w:r>
+        <w:rPr>
+          <w:noProof/>
+        </w:rPr>
+        <w:t>Για τον λόγο αυτό επιλέχθηκε μια ασύγχρονη αρχιτεκτονική καταγραφής, όπου η κύρια επιχειρησιακή λειτουργία αποθηκεύεται άμεσα και η καταγραφή του audit πραγματοποιείται στο παρασκήνιο μέσω ουράς μνήμης.</w:t>
+      </w:r>
+    </w:p>
+    <w:p>
+      <w:pPr>
+        <w:pStyle w:val="2"/>
+        <w:rPr>
+          <w:noProof/>
+        </w:rPr>
+      </w:pPr>
+      <w:r>
+        <w:rPr>
+          <w:noProof/>
+        </w:rPr>
+        <w:t>Αρχιτεκτονική του μηχανισμού Audit Logging</w:t>
+      </w:r>
+    </w:p>
+    <w:p>
+      <w:pPr>
+        <w:pStyle w:val="3"/>
+        <w:rPr>
+          <w:noProof/>
+        </w:rPr>
+      </w:pPr>
+      <w:r>
+        <w:rPr>
+          <w:noProof/>
+        </w:rPr>
+        <w:t xml:space="preserve"> AuditChannel – Ουρά μνήμης</w:t>
+      </w:r>
+    </w:p>
+    <w:p>
+      <w:pPr>
+        <w:jc w:val="both"/>
+        <w:rPr>
+          <w:noProof/>
+        </w:rPr>
+      </w:pPr>
+      <w:r>
+        <w:rPr>
+          <w:noProof/>
+        </w:rPr>
+        <w:t>Η εφαρμογή χρησιμοποιεί ένα Channel&lt;AuditLog&gt; του .NET ως thread-safe ουρά επικοινωνίας μεταξύ των HTTP requests και της υπηρεσίας καταγραφής.</w:t>
+      </w:r>
+    </w:p>
+    <w:p>
+      <w:pPr>
+        <w:jc w:val="both"/>
+        <w:rPr>
+          <w:noProof/>
+        </w:rPr>
+      </w:pPr>
+      <w:r>
+        <w:rPr>
+          <w:noProof/>
+        </w:rPr>
+        <w:t>Το κανάλι έχει χωρητικότητα 5.000 εγγραφών και λειτουργεί με πολιτική DropOldest, ώστε σε περιόδους έντονης κίνησης να απορρίπτονται τα παλαιότερα logs αντί να μπλοκάρονται τα αιτήματα των χρηστών.</w:t>
+      </w:r>
+    </w:p>
+    <w:p>
+      <w:pPr>
+        <w:jc w:val="both"/>
+        <w:rPr>
+          <w:noProof/>
+        </w:rPr>
+      </w:pPr>
+      <w:r>
+        <w:rPr>
+          <w:noProof/>
+        </w:rPr>
+        <w:t>Η εισαγωγή ενός log στην ουρά γίνεται με TryWrite, μια λειτουργία σταθερού χρόνου O(1), η οποία ολοκληρώνεται σχεδόν άμεσα και δεν καθυστερεί το HTTP request.</w:t>
+      </w:r>
+    </w:p>
+    <w:p>
+      <w:pPr>
+        <w:pStyle w:val="3"/>
+        <w:rPr>
+          <w:noProof/>
+        </w:rPr>
+      </w:pPr>
+      <w:r>
+        <w:rPr>
+          <w:noProof/>
+        </w:rPr>
+        <w:t>AuditDbContext – Ξεχωριστό DbContext</w:t>
+      </w:r>
+    </w:p>
+    <w:p>
+      <w:pPr>
+        <w:jc w:val="both"/>
+        <w:rPr>
+          <w:noProof/>
+        </w:rPr>
+      </w:pPr>
+      <w:r>
+        <w:rPr>
+          <w:noProof/>
+        </w:rPr>
+        <w:t>Για την αποθήκευση των audit logs χρησιμοποιείται ξεχωριστό AuditDbContext.</w:t>
+      </w:r>
+    </w:p>
+    <w:p>
+      <w:pPr>
+        <w:jc w:val="both"/>
+        <w:rPr>
+          <w:noProof/>
+        </w:rPr>
+      </w:pPr>
+      <w:r>
+        <w:rPr>
+          <w:noProof/>
+        </w:rPr>
+        <w:t>Το κύριο AppDbContext εξαρτάται από πληροφορίες του τρέχοντος HTTP request (π.χ. tenant και χρήστη), οι οποίες δεν είναι διαθέσιμες σε background διεργασίες. Επομένως, η χρήση του σε υπηρεσία παρασκηνίου θα οδηγούσε σε σφάλματα.</w:t>
+      </w:r>
+    </w:p>
+    <w:p>
+      <w:pPr>
+        <w:jc w:val="both"/>
+        <w:rPr>
+          <w:noProof/>
+        </w:rPr>
+      </w:pPr>
+      <w:r>
+        <w:rPr>
+          <w:noProof/>
+        </w:rPr>
+        <w:t>Το AuditDbContext περιέχει μόνο τον πίνακα AuditLogs και λειτουργεί αποκλειστικά ως μηχανισμός εγγραφής των logs.</w:t>
+      </w:r>
+    </w:p>
+    <w:p>
+      <w:pPr>
+        <w:pStyle w:val="3"/>
+        <w:rPr>
+          <w:noProof/>
+        </w:rPr>
+      </w:pPr>
+      <w:r>
+        <w:rPr>
+          <w:noProof/>
+        </w:rPr>
+        <w:t>AuditBackgroundService – Καταναλωτής της ουράς</w:t>
+      </w:r>
+    </w:p>
+    <w:p>
+      <w:pPr>
+        <w:jc w:val="both"/>
+        <w:rPr>
+          <w:noProof/>
+        </w:rPr>
+      </w:pPr>
+      <w:r>
+        <w:rPr>
+          <w:noProof/>
+        </w:rPr>
+        <w:t>Η πραγματική αποθήκευση των logs υλοποιείται από μια BackgroundService, η οποία εκτελείται καθ’ όλη τη διάρκεια ζωής της εφαρμογής.</w:t>
+      </w:r>
+    </w:p>
+    <w:p>
+      <w:pPr>
+        <w:jc w:val="both"/>
+        <w:rPr>
+          <w:noProof/>
+        </w:rPr>
+      </w:pPr>
+      <w:r>
+        <w:rPr>
+          <w:noProof/>
+        </w:rPr>
+        <w:lastRenderedPageBreak/>
+        <w:t>Η υπηρεσία:</w:t>
+      </w:r>
+    </w:p>
+    <w:p>
+      <w:pPr>
+        <w:numPr>
+          <w:ilvl w:val="0"/>
+          <w:numId w:val="51"/>
+        </w:numPr>
+        <w:jc w:val="both"/>
+        <w:rPr>
+          <w:noProof/>
+        </w:rPr>
+      </w:pPr>
+      <w:r>
+        <w:rPr>
+          <w:noProof/>
+        </w:rPr>
+        <w:t>Περιμένει ασύγχρονα μέχρι να υπάρχουν δεδομένα στην ουρά.</w:t>
+      </w:r>
+    </w:p>
+    <w:p>
+      <w:pPr>
+        <w:numPr>
+          <w:ilvl w:val="0"/>
+          <w:numId w:val="51"/>
+        </w:numPr>
+        <w:jc w:val="both"/>
+        <w:rPr>
+          <w:noProof/>
+        </w:rPr>
+      </w:pPr>
+      <w:r>
+        <w:rPr>
+          <w:noProof/>
+        </w:rPr>
+        <w:t>Συλλέγει έως 50 logs κάθε φορά.</w:t>
+      </w:r>
+    </w:p>
+    <w:p>
+      <w:pPr>
+        <w:numPr>
+          <w:ilvl w:val="0"/>
+          <w:numId w:val="51"/>
+        </w:numPr>
+        <w:jc w:val="both"/>
+        <w:rPr>
+          <w:noProof/>
+        </w:rPr>
+      </w:pPr>
+      <w:r>
+        <w:rPr>
+          <w:noProof/>
+        </w:rPr>
+        <w:t>Δημιουργεί νέο DI scope για τη λήψη του AuditDbContext.</w:t>
+      </w:r>
+    </w:p>
+    <w:p>
+      <w:pPr>
+        <w:numPr>
+          <w:ilvl w:val="0"/>
+          <w:numId w:val="51"/>
+        </w:numPr>
+        <w:jc w:val="both"/>
+        <w:rPr>
+          <w:noProof/>
+        </w:rPr>
+      </w:pPr>
+      <w:r>
+        <w:rPr>
+          <w:noProof/>
+        </w:rPr>
+        <w:t>Αποθηκεύει όλα τα logs με μία κλήση SaveChangesAsync, μειώνοντας σημαντικά τον αριθμό των εγγραφών στη βάση.</w:t>
+      </w:r>
+    </w:p>
+    <w:p>
+      <w:pPr>
+        <w:numPr>
+          <w:ilvl w:val="0"/>
+          <w:numId w:val="51"/>
+        </w:numPr>
+        <w:jc w:val="both"/>
+        <w:rPr>
+          <w:noProof/>
+        </w:rPr>
+      </w:pPr>
+      <w:r>
+        <w:rPr>
+          <w:noProof/>
+        </w:rPr>
+        <w:t>Σε περίπτωση αποτυχίας καταγράφει το σφάλμα και επαναπροσπαθεί μετά από μικρή καθυστέρηση.</w:t>
+      </w:r>
+    </w:p>
+    <w:p>
+      <w:pPr>
+        <w:jc w:val="both"/>
+        <w:rPr>
+          <w:noProof/>
+        </w:rPr>
+      </w:pPr>
+      <w:r>
+        <w:rPr>
+          <w:noProof/>
+        </w:rPr>
+        <w:t>Η ομαδοποίηση των εγγραφών (batching) μειώνει το φορτίο της βάσης δεδομένων και βελτιώνει τη συνολική απόδοση.</w:t>
+      </w:r>
+    </w:p>
+    <w:p>
+      <w:pPr>
+        <w:pStyle w:val="3"/>
+        <w:rPr>
+          <w:noProof/>
+        </w:rPr>
+      </w:pPr>
+      <w:r>
+        <w:rPr>
+          <w:noProof/>
+        </w:rPr>
+        <w:t>AppDbContext – Αυτόματη δημιουργία audit entries</w:t>
+      </w:r>
+    </w:p>
+    <w:p>
+      <w:pPr>
+        <w:jc w:val="both"/>
+        <w:rPr>
+          <w:noProof/>
+        </w:rPr>
+      </w:pPr>
+      <w:r>
+        <w:rPr>
+          <w:noProof/>
+        </w:rPr>
+        <w:t>Ο μηχανισμός ενεργοποιείται αυτόματα μέσω υπερφόρτωσης της μεθόδου SaveChangesAsync του AppDbContext.</w:t>
+      </w:r>
+    </w:p>
+    <w:p>
+      <w:pPr>
+        <w:jc w:val="both"/>
+        <w:rPr>
+          <w:noProof/>
+        </w:rPr>
+      </w:pPr>
+      <w:r>
+        <w:rPr>
+          <w:noProof/>
+        </w:rPr>
+        <w:t>Πριν από την αποθήκευση, η εφαρμογή εξετάζει το ChangeTracker του Entity Framework Core και εντοπίζει όλες τις αλλαγές στις οντότητες.</w:t>
+      </w:r>
+    </w:p>
+    <w:p>
+      <w:pPr>
+        <w:jc w:val="both"/>
+        <w:rPr>
+          <w:noProof/>
+        </w:rPr>
+      </w:pPr>
+      <w:r>
+        <w:rPr>
+          <w:noProof/>
+        </w:rPr>
+        <w:t>Για κάθε οντότητα που κληρονομεί από BaseEntity δημιουργείται αντίστοιχη εγγραφή audit:</w:t>
+      </w:r>
+    </w:p>
+    <w:tbl>
+      <w:tblPr>
+        <w:tblStyle w:val="6-5"/>
+        <w:tblW w:w="0" w:type="auto"/>
+        <w:tblLook w:val="04A0" w:firstRow="1" w:lastRow="0" w:firstColumn="1" w:lastColumn="0" w:noHBand="0" w:noVBand="1"/>
+      </w:tblPr>
+      <w:tblGrid>
+        <w:gridCol w:w="1349"/>
+        <w:gridCol w:w="4400"/>
+      </w:tblGrid>
+      <w:tr>
+        <w:trPr>
+          <w:cnfStyle w:val="100000000000" w:firstRow="1" w:lastRow="0" w:firstColumn="0" w:lastColumn="0" w:oddVBand="0" w:evenVBand="0" w:oddHBand="0" w:evenHBand="0" w:firstRowFirstColumn="0" w:firstRowLastColumn="0" w:lastRowFirstColumn="0" w:lastRowLastColumn="0"/>
+        </w:trPr>
+        <w:tc>
+          <w:tcPr>
+            <w:cnfStyle w:val="001000000000" w:firstRow="0" w:lastRow="0" w:firstColumn="1" w:lastColumn="0" w:oddVBand="0" w:evenVBand="0" w:oddHBand="0" w:evenHBand="0" w:firstRowFirstColumn="0" w:firstRowLastColumn="0" w:lastRowFirstColumn="0" w:lastRowLastColumn="0"/>
+            <w:tcW w:w="0" w:type="auto"/>
+            <w:hideMark/>
+          </w:tcPr>
+          <w:p>
+            <w:pPr>
+              <w:spacing w:after="160" w:line="278" w:lineRule="auto"/>
+              <w:jc w:val="both"/>
+              <w:rPr>
+                <w:noProof/>
+              </w:rPr>
+            </w:pPr>
+            <w:r>
+              <w:rPr>
+                <w:noProof/>
+              </w:rPr>
+              <w:t>Κατάσταση</w:t>
+            </w:r>
+          </w:p>
+        </w:tc>
+        <w:tc>
+          <w:tcPr>
+            <w:tcW w:w="0" w:type="auto"/>
+            <w:hideMark/>
+          </w:tcPr>
+          <w:p>
+            <w:pPr>
+              <w:spacing w:after="160" w:line="278" w:lineRule="auto"/>
+              <w:jc w:val="both"/>
+              <w:cnfStyle w:val="100000000000" w:firstRow="1" w:lastRow="0" w:firstColumn="0" w:lastColumn="0" w:oddVBand="0" w:evenVBand="0" w:oddHBand="0" w:evenHBand="0" w:firstRowFirstColumn="0" w:firstRowLastColumn="0" w:lastRowFirstColumn="0" w:lastRowLastColumn="0"/>
+              <w:rPr>
+                <w:noProof/>
+              </w:rPr>
+            </w:pPr>
+            <w:r>
+              <w:rPr>
+                <w:noProof/>
+              </w:rPr>
+              <w:t>Περιεχόμενο log</w:t>
+            </w:r>
+          </w:p>
+        </w:tc>
+      </w:tr>
+      <w:tr>
+        <w:trPr>
+          <w:cnfStyle w:val="000000100000" w:firstRow="0" w:lastRow="0" w:firstColumn="0" w:lastColumn="0" w:oddVBand="0" w:evenVBand="0" w:oddHBand="1" w:evenHBand="0" w:firstRowFirstColumn="0" w:firstRowLastColumn="0" w:lastRowFirstColumn="0" w:lastRowLastColumn="0"/>
+        </w:trPr>
+        <w:tc>
+          <w:tcPr>
+            <w:cnfStyle w:val="001000000000" w:firstRow="0" w:lastRow="0" w:firstColumn="1" w:lastColumn="0" w:oddVBand="0" w:evenVBand="0" w:oddHBand="0" w:evenHBand="0" w:firstRowFirstColumn="0" w:firstRowLastColumn="0" w:lastRowFirstColumn="0" w:lastRowLastColumn="0"/>
+            <w:tcW w:w="0" w:type="auto"/>
+            <w:hideMark/>
+          </w:tcPr>
+          <w:p>
+            <w:pPr>
+              <w:spacing w:after="160" w:line="278" w:lineRule="auto"/>
+              <w:jc w:val="both"/>
+              <w:rPr>
+                <w:noProof/>
+              </w:rPr>
+            </w:pPr>
+            <w:r>
+              <w:rPr>
+                <w:noProof/>
+              </w:rPr>
+              <w:t>Added</w:t>
+            </w:r>
+          </w:p>
+        </w:tc>
+        <w:tc>
+          <w:tcPr>
+            <w:tcW w:w="0" w:type="auto"/>
+            <w:hideMark/>
+          </w:tcPr>
+          <w:p>
+            <w:pPr>
+              <w:spacing w:after="160" w:line="278" w:lineRule="auto"/>
+              <w:jc w:val="both"/>
+              <w:cnfStyle w:val="000000100000" w:firstRow="0" w:lastRow="0" w:firstColumn="0" w:lastColumn="0" w:oddVBand="0" w:evenVBand="0" w:oddHBand="1" w:evenHBand="0" w:firstRowFirstColumn="0" w:firstRowLastColumn="0" w:lastRowFirstColumn="0" w:lastRowLastColumn="0"/>
+              <w:rPr>
+                <w:noProof/>
+              </w:rPr>
+            </w:pPr>
+            <w:r>
+              <w:rPr>
+                <w:noProof/>
+              </w:rPr>
+              <w:t>Καταγράφονται οι νέες τιμές.</w:t>
+            </w:r>
+          </w:p>
+        </w:tc>
+      </w:tr>
+      <w:tr>
+        <w:tc>
+          <w:tcPr>
+            <w:cnfStyle w:val="001000000000" w:firstRow="0" w:lastRow="0" w:firstColumn="1" w:lastColumn="0" w:oddVBand="0" w:evenVBand="0" w:oddHBand="0" w:evenHBand="0" w:firstRowFirstColumn="0" w:firstRowLastColumn="0" w:lastRowFirstColumn="0" w:lastRowLastColumn="0"/>
+            <w:tcW w:w="0" w:type="auto"/>
+            <w:hideMark/>
+          </w:tcPr>
+          <w:p>
+            <w:pPr>
+              <w:spacing w:after="160" w:line="278" w:lineRule="auto"/>
+              <w:jc w:val="both"/>
+              <w:rPr>
+                <w:noProof/>
+              </w:rPr>
+            </w:pPr>
+            <w:r>
+              <w:rPr>
+                <w:noProof/>
+              </w:rPr>
+              <w:t>Modified</w:t>
+            </w:r>
+          </w:p>
+        </w:tc>
+        <w:tc>
+          <w:tcPr>
+            <w:tcW w:w="0" w:type="auto"/>
+            <w:hideMark/>
+          </w:tcPr>
+          <w:p>
+            <w:pPr>
+              <w:spacing w:after="160" w:line="278" w:lineRule="auto"/>
+              <w:jc w:val="both"/>
+              <w:cnfStyle w:val="000000000000" w:firstRow="0" w:lastRow="0" w:firstColumn="0" w:lastColumn="0" w:oddVBand="0" w:evenVBand="0" w:oddHBand="0" w:evenHBand="0" w:firstRowFirstColumn="0" w:firstRowLastColumn="0" w:lastRowFirstColumn="0" w:lastRowLastColumn="0"/>
+              <w:rPr>
+                <w:noProof/>
+              </w:rPr>
+            </w:pPr>
+            <w:r>
+              <w:rPr>
+                <w:noProof/>
+              </w:rPr>
+              <w:t>Καταγράφονται οι παλιές και οι νέες τιμές.</w:t>
+            </w:r>
+          </w:p>
+        </w:tc>
+      </w:tr>
+      <w:tr>
+        <w:trPr>
+          <w:cnfStyle w:val="000000100000" w:firstRow="0" w:lastRow="0" w:firstColumn="0" w:lastColumn="0" w:oddVBand="0" w:evenVBand="0" w:oddHBand="1" w:evenHBand="0" w:firstRowFirstColumn="0" w:firstRowLastColumn="0" w:lastRowFirstColumn="0" w:lastRowLastColumn="0"/>
+        </w:trPr>
+        <w:tc>
+          <w:tcPr>
+            <w:cnfStyle w:val="001000000000" w:firstRow="0" w:lastRow="0" w:firstColumn="1" w:lastColumn="0" w:oddVBand="0" w:evenVBand="0" w:oddHBand="0" w:evenHBand="0" w:firstRowFirstColumn="0" w:firstRowLastColumn="0" w:lastRowFirstColumn="0" w:lastRowLastColumn="0"/>
+            <w:tcW w:w="0" w:type="auto"/>
+            <w:hideMark/>
+          </w:tcPr>
+          <w:p>
+            <w:pPr>
+              <w:spacing w:after="160" w:line="278" w:lineRule="auto"/>
+              <w:jc w:val="both"/>
+              <w:rPr>
+                <w:noProof/>
+              </w:rPr>
+            </w:pPr>
+            <w:r>
+              <w:rPr>
+                <w:noProof/>
+              </w:rPr>
+              <w:t>Deleted</w:t>
+            </w:r>
+          </w:p>
+        </w:tc>
+        <w:tc>
+          <w:tcPr>
+            <w:tcW w:w="0" w:type="auto"/>
+            <w:hideMark/>
+          </w:tcPr>
+          <w:p>
+            <w:pPr>
+              <w:spacing w:after="160" w:line="278" w:lineRule="auto"/>
+              <w:jc w:val="both"/>
+              <w:cnfStyle w:val="000000100000" w:firstRow="0" w:lastRow="0" w:firstColumn="0" w:lastColumn="0" w:oddVBand="0" w:evenVBand="0" w:oddHBand="1" w:evenHBand="0" w:firstRowFirstColumn="0" w:firstRowLastColumn="0" w:lastRowFirstColumn="0" w:lastRowLastColumn="0"/>
+              <w:rPr>
+                <w:noProof/>
+              </w:rPr>
+            </w:pPr>
+            <w:r>
+              <w:rPr>
+                <w:noProof/>
+              </w:rPr>
+              <w:t>Καταγράφονται οι προηγούμενες τιμές.</w:t>
+            </w:r>
+          </w:p>
+        </w:tc>
+      </w:tr>
+    </w:tbl>
+    <w:p>
+      <w:pPr>
+        <w:jc w:val="both"/>
+        <w:rPr>
+          <w:noProof/>
+        </w:rPr>
+      </w:pPr>
+      <w:r>
+        <w:rPr>
+          <w:noProof/>
+        </w:rPr>
+        <w:t>Μετά την επιτυχημένη αποθήκευση των δεδομένων, τα audit entries τοποθετούνται στην ουρά μνήμης, χωρίς να καθυστερεί η απόκριση του API.</w:t>
+      </w:r>
+    </w:p>
+    <w:p>
+      <w:pPr>
+        <w:pStyle w:val="3"/>
+        <w:rPr>
+          <w:noProof/>
+        </w:rPr>
+      </w:pPr>
+      <w:r>
+        <w:rPr>
+          <w:noProof/>
+        </w:rPr>
+        <w:t>Καταχώρηση υπηρεσιών</w:t>
+      </w:r>
+    </w:p>
+    <w:p>
+      <w:pPr>
+        <w:jc w:val="both"/>
+        <w:rPr>
+          <w:noProof/>
+        </w:rPr>
+      </w:pPr>
+      <w:r>
+        <w:rPr>
+          <w:noProof/>
+        </w:rPr>
+        <w:t>Στο Program.cs καταχωρούνται:</w:t>
+      </w:r>
+    </w:p>
+    <w:p>
+      <w:pPr>
+        <w:numPr>
+          <w:ilvl w:val="0"/>
+          <w:numId w:val="52"/>
+        </w:numPr>
+        <w:jc w:val="both"/>
+        <w:rPr>
+          <w:noProof/>
+        </w:rPr>
+      </w:pPr>
+      <w:r>
+        <w:rPr>
+          <w:noProof/>
+        </w:rPr>
+        <w:t>Το AuditChannel ως Singleton, ώστε όλα τα requests να χρησιμοποιούν την ίδια ουρά.</w:t>
+      </w:r>
+    </w:p>
+    <w:p>
+      <w:pPr>
+        <w:numPr>
+          <w:ilvl w:val="0"/>
+          <w:numId w:val="52"/>
+        </w:numPr>
+        <w:jc w:val="both"/>
+        <w:rPr>
+          <w:noProof/>
+        </w:rPr>
+      </w:pPr>
+      <w:r>
+        <w:rPr>
+          <w:noProof/>
+        </w:rPr>
+        <w:t>Η AuditBackgroundService, η οποία ξεκινά αυτόματα με την εφαρμογή.</w:t>
+      </w:r>
+    </w:p>
+    <w:p>
+      <w:pPr>
+        <w:numPr>
+          <w:ilvl w:val="0"/>
+          <w:numId w:val="52"/>
+        </w:numPr>
+        <w:jc w:val="both"/>
+        <w:rPr>
+          <w:noProof/>
+        </w:rPr>
+      </w:pPr>
+      <w:r>
+        <w:rPr>
+          <w:noProof/>
+        </w:rPr>
+        <w:t>Το AuditDbContext, το οποίο χρησιμοποιείται αποκλειστικά από την υπηρεσία παρασκηνίου.</w:t>
+      </w:r>
+    </w:p>
+    <w:p>
+      <w:pPr>
+        <w:pStyle w:val="2"/>
+        <w:rPr>
+          <w:noProof/>
+        </w:rPr>
+      </w:pPr>
+      <w:r>
+        <w:rPr>
+          <w:noProof/>
+        </w:rPr>
+        <w:lastRenderedPageBreak/>
+        <w:t xml:space="preserve">Αποτέλεσμα </w:t>
+      </w:r>
+    </w:p>
+    <w:p>
+      <w:pPr>
+        <w:jc w:val="both"/>
+        <w:rPr>
+          <w:noProof/>
+        </w:rPr>
+      </w:pPr>
+      <w:r>
+        <w:rPr>
+          <w:noProof/>
+        </w:rPr>
+        <w:t>Η παραπάνω αρχιτεκτονική επιτρέπει στην εφαρμογή να διατηρεί πλήρες ιστορικό ενεργειών για όλες τις βασικές οντότητες (Assets, Customers, Contracts κ.ά.), παρέχοντας ιχνηλασιμότητα και δυνατότητα ελέγχου αλλαγών.</w:t>
+      </w:r>
+    </w:p>
+    <w:p>
+      <w:pPr>
+        <w:jc w:val="both"/>
+        <w:rPr>
+          <w:noProof/>
+        </w:rPr>
+      </w:pPr>
+      <w:r>
+        <w:rPr>
+          <w:noProof/>
+        </w:rPr>
+        <w:t>Ταυτόχρονα, η χρήση ασύγχρονης ουράς και background επεξεργασίας εξασφαλίζει ότι η καταγραφή των audit logs έχει ελάχιστη επίπτωση στην απόδοση του API, ακόμη και σε περιβάλλον με πολλούς ταυτόχρονους χρήστες.</w:t>
+      </w:r>
+    </w:p>
+    <w:p>
+      <w:pPr>
+        <w:jc w:val="both"/>
+        <w:rPr>
+          <w:noProof/>
+        </w:rPr>
+      </w:pPr>
+    </w:p>
     <w:sectPr>
       <w:pgSz w:w="11906" w:h="16838"/>
       <w:pgMar w:top="1440" w:right="1800" w:bottom="1440" w:left="1800" w:header="708" w:footer="708" w:gutter="0"/>
@@ -19345,6 +20091,155 @@
     </w:lvl>
   </w:abstractNum>
   <w:abstractNum w:abstractNumId="1" w15:restartNumberingAfterBreak="0">
+    <w:nsid w:val="03BA35D6"/>
+    <w:multiLevelType w:val="multilevel"/>
+    <w:tmpl w:val="2E4A19FC"/>
+    <w:lvl w:ilvl="0">
+      <w:start w:val="1"/>
+      <w:numFmt w:val="bullet"/>
+      <w:lvlText w:val=""/>
+      <w:lvlJc w:val="left"/>
+      <w:pPr>
+        <w:tabs>
+          <w:tab w:val="num" w:pos="720"/>
+        </w:tabs>
+        <w:ind w:left="720" w:hanging="360"/>
+      </w:pPr>
+      <w:rPr>
+        <w:rFonts w:ascii="Symbol" w:hAnsi="Symbol" w:hint="default"/>
+        <w:sz w:val="20"/>
+      </w:rPr>
+    </w:lvl>
+    <w:lvl w:ilvl="1" w:tentative="1">
+      <w:start w:val="1"/>
+      <w:numFmt w:val="bullet"/>
+      <w:lvlText w:val="o"/>
+      <w:lvlJc w:val="left"/>
+      <w:pPr>
+        <w:tabs>
+          <w:tab w:val="num" w:pos="1440"/>
+        </w:tabs>
+        <w:ind w:left="1440" w:hanging="360"/>
+      </w:pPr>
+      <w:rPr>
+        <w:rFonts w:ascii="Courier New" w:hAnsi="Courier New" w:hint="default"/>
+        <w:sz w:val="20"/>
+      </w:rPr>
+    </w:lvl>
+    <w:lvl w:ilvl="2" w:tentative="1">
+      <w:start w:val="1"/>
+      <w:numFmt w:val="bullet"/>
+      <w:lvlText w:val=""/>
+      <w:lvlJc w:val="left"/>
+      <w:pPr>
+        <w:tabs>
+          <w:tab w:val="num" w:pos="2160"/>
+        </w:tabs>
+        <w:ind w:left="2160" w:hanging="360"/>
+      </w:pPr>
+      <w:rPr>
+        <w:rFonts w:ascii="Wingdings" w:hAnsi="Wingdings" w:hint="default"/>
+        <w:sz w:val="20"/>
+      </w:rPr>
+    </w:lvl>
+    <w:lvl w:ilvl="3" w:tentative="1">
+      <w:start w:val="1"/>
+      <w:numFmt w:val="bullet"/>
+      <w:lvlText w:val=""/>
+      <w:lvlJc w:val="left"/>
+      <w:pPr>
+        <w:tabs>
+          <w:tab w:val="num" w:pos="2880"/>
+        </w:tabs>
+        <w:ind w:left="2880" w:hanging="360"/>
+      </w:pPr>
+      <w:rPr>
+        <w:rFonts w:ascii="Wingdings" w:hAnsi="Wingdings" w:hint="default"/>
+        <w:sz w:val="20"/>
+      </w:rPr>
+    </w:lvl>
+    <w:lvl w:ilvl="4" w:tentative="1">
+      <w:start w:val="1"/>
+      <w:numFmt w:val="bullet"/>
+      <w:lvlText w:val=""/>
+      <w:lvlJc w:val="left"/>
+      <w:pPr>
+        <w:tabs>
+          <w:tab w:val="num" w:pos="3600"/>
+        </w:tabs>
+        <w:ind w:left="3600" w:hanging="360"/>
+      </w:pPr>
+      <w:rPr>
+        <w:rFonts w:ascii="Wingdings" w:hAnsi="Wingdings" w:hint="default"/>
+        <w:sz w:val="20"/>
+      </w:rPr>
+    </w:lvl>
+    <w:lvl w:ilvl="5" w:tentative="1">
+      <w:start w:val="1"/>
+      <w:numFmt w:val="bullet"/>
+      <w:lvlText w:val=""/>
+      <w:lvlJc w:val="left"/>
+      <w:pPr>
+        <w:tabs>
+          <w:tab w:val="num" w:pos="4320"/>
+        </w:tabs>
+        <w:ind w:left="4320" w:hanging="360"/>
+      </w:pPr>
+      <w:rPr>
+        <w:rFonts w:ascii="Wingdings" w:hAnsi="Wingdings" w:hint="default"/>
+        <w:sz w:val="20"/>
+      </w:rPr>
+    </w:lvl>
+    <w:lvl w:ilvl="6" w:tentative="1">
+      <w:start w:val="1"/>
+      <w:numFmt w:val="bullet"/>
+      <w:lvlText w:val=""/>
+      <w:lvlJc w:val="left"/>
+      <w:pPr>
+        <w:tabs>
+          <w:tab w:val="num" w:pos="5040"/>
+        </w:tabs>
+        <w:ind w:left="5040" w:hanging="360"/>
+      </w:pPr>
+      <w:rPr>
+        <w:rFonts w:ascii="Wingdings" w:hAnsi="Wingdings" w:hint="default"/>
+        <w:sz w:val="20"/>
+      </w:rPr>
+    </w:lvl>
+    <w:lvl w:ilvl="7" w:tentative="1">
+      <w:start w:val="1"/>
+      <w:numFmt w:val="bullet"/>
+      <w:lvlText w:val=""/>
+      <w:lvlJc w:val="left"/>
+      <w:pPr>
+        <w:tabs>
+          <w:tab w:val="num" w:pos="5760"/>
+        </w:tabs>
+        <w:ind w:left="5760" w:hanging="360"/>
+      </w:pPr>
+      <w:rPr>
+        <w:rFonts w:ascii="Wingdings" w:hAnsi="Wingdings" w:hint="default"/>
+        <w:sz w:val="20"/>
+      </w:rPr>
+    </w:lvl>
+    <w:lvl w:ilvl="8" w:tentative="1">
+      <w:start w:val="1"/>
+      <w:numFmt w:val="bullet"/>
+      <w:lvlText w:val=""/>
+      <w:lvlJc w:val="left"/>
+      <w:pPr>
+        <w:tabs>
+          <w:tab w:val="num" w:pos="6480"/>
+        </w:tabs>
+        <w:ind w:left="6480" w:hanging="360"/>
+      </w:pPr>
+      <w:rPr>
+        <w:rFonts w:ascii="Wingdings" w:hAnsi="Wingdings" w:hint="default"/>
+        <w:sz w:val="20"/>
+      </w:rPr>
+    </w:lvl>
+  </w:abstractNum>
+  <w:abstractNum w:abstractNumId="2" w15:restartNumberingAfterBreak="0">
     <w:nsid w:val="05FE0693"/>
     <w:multiLevelType w:val="hybridMultilevel"/>
     <w:tmpl w:val="CB02C0B6"/>
@@ -19431,7 +20326,7 @@
       </w:pPr>
     </w:lvl>
   </w:abstractNum>
-  <w:abstractNum w:abstractNumId="2" w15:restartNumberingAfterBreak="0">
+  <w:abstractNum w:abstractNumId="3" w15:restartNumberingAfterBreak="0">
     <w:nsid w:val="09DE2DA9"/>
     <w:multiLevelType w:val="multilevel"/>
     <w:tmpl w:val="DFA088A4"/>
@@ -19580,7 +20475,7 @@
       </w:rPr>
     </w:lvl>
   </w:abstractNum>
-  <w:abstractNum w:abstractNumId="3" w15:restartNumberingAfterBreak="0">
+  <w:abstractNum w:abstractNumId="4" w15:restartNumberingAfterBreak="0">
     <w:nsid w:val="0C5D0DB4"/>
     <w:multiLevelType w:val="multilevel"/>
     <w:tmpl w:val="D6922138"/>
@@ -19729,7 +20624,7 @@
       </w:rPr>
     </w:lvl>
   </w:abstractNum>
-  <w:abstractNum w:abstractNumId="4" w15:restartNumberingAfterBreak="0">
+  <w:abstractNum w:abstractNumId="5" w15:restartNumberingAfterBreak="0">
     <w:nsid w:val="0CB9514C"/>
     <w:multiLevelType w:val="multilevel"/>
     <w:tmpl w:val="248C5104"/>
@@ -19878,7 +20773,7 @@
       </w:rPr>
     </w:lvl>
   </w:abstractNum>
-  <w:abstractNum w:abstractNumId="5" w15:restartNumberingAfterBreak="0">
+  <w:abstractNum w:abstractNumId="6" w15:restartNumberingAfterBreak="0">
     <w:nsid w:val="10EF6193"/>
     <w:multiLevelType w:val="multilevel"/>
     <w:tmpl w:val="1366A9C4"/>
@@ -20027,7 +20922,7 @@
       </w:rPr>
     </w:lvl>
   </w:abstractNum>
-  <w:abstractNum w:abstractNumId="6" w15:restartNumberingAfterBreak="0">
+  <w:abstractNum w:abstractNumId="7" w15:restartNumberingAfterBreak="0">
     <w:nsid w:val="12C77DCE"/>
     <w:multiLevelType w:val="multilevel"/>
     <w:tmpl w:val="160064F4"/>
@@ -20176,7 +21071,7 @@
       </w:rPr>
     </w:lvl>
   </w:abstractNum>
-  <w:abstractNum w:abstractNumId="7" w15:restartNumberingAfterBreak="0">
+  <w:abstractNum w:abstractNumId="8" w15:restartNumberingAfterBreak="0">
     <w:nsid w:val="141D4B96"/>
     <w:multiLevelType w:val="multilevel"/>
     <w:tmpl w:val="01E61F4A"/>
@@ -20325,7 +21220,7 @@
       </w:rPr>
     </w:lvl>
   </w:abstractNum>
-  <w:abstractNum w:abstractNumId="8" w15:restartNumberingAfterBreak="0">
+  <w:abstractNum w:abstractNumId="9" w15:restartNumberingAfterBreak="0">
     <w:nsid w:val="149B26DA"/>
     <w:multiLevelType w:val="multilevel"/>
     <w:tmpl w:val="4A60B57E"/>
@@ -20474,7 +21369,7 @@
       </w:rPr>
     </w:lvl>
   </w:abstractNum>
-  <w:abstractNum w:abstractNumId="9" w15:restartNumberingAfterBreak="0">
+  <w:abstractNum w:abstractNumId="10" w15:restartNumberingAfterBreak="0">
     <w:nsid w:val="183A24CF"/>
     <w:multiLevelType w:val="multilevel"/>
     <w:tmpl w:val="AD809842"/>
@@ -20623,7 +21518,7 @@
       </w:rPr>
     </w:lvl>
   </w:abstractNum>
-  <w:abstractNum w:abstractNumId="10" w15:restartNumberingAfterBreak="0">
+  <w:abstractNum w:abstractNumId="11" w15:restartNumberingAfterBreak="0">
     <w:nsid w:val="1A2E1F9A"/>
     <w:multiLevelType w:val="multilevel"/>
     <w:tmpl w:val="2EFE4D8C"/>
@@ -20772,7 +21667,156 @@
       </w:rPr>
     </w:lvl>
   </w:abstractNum>
-  <w:abstractNum w:abstractNumId="11" w15:restartNumberingAfterBreak="0">
+  <w:abstractNum w:abstractNumId="12" w15:restartNumberingAfterBreak="0">
+    <w:nsid w:val="2297260A"/>
+    <w:multiLevelType w:val="multilevel"/>
+    <w:tmpl w:val="EF067C0C"/>
+    <w:lvl w:ilvl="0">
+      <w:start w:val="1"/>
+      <w:numFmt w:val="bullet"/>
+      <w:lvlText w:val=""/>
+      <w:lvlJc w:val="left"/>
+      <w:pPr>
+        <w:tabs>
+          <w:tab w:val="num" w:pos="720"/>
+        </w:tabs>
+        <w:ind w:left="720" w:hanging="360"/>
+      </w:pPr>
+      <w:rPr>
+        <w:rFonts w:ascii="Symbol" w:hAnsi="Symbol" w:hint="default"/>
+        <w:sz w:val="20"/>
+      </w:rPr>
+    </w:lvl>
+    <w:lvl w:ilvl="1" w:tentative="1">
+      <w:start w:val="1"/>
+      <w:numFmt w:val="bullet"/>
+      <w:lvlText w:val="o"/>
+      <w:lvlJc w:val="left"/>
+      <w:pPr>
+        <w:tabs>
+          <w:tab w:val="num" w:pos="1440"/>
+        </w:tabs>
+        <w:ind w:left="1440" w:hanging="360"/>
+      </w:pPr>
+      <w:rPr>
+        <w:rFonts w:ascii="Courier New" w:hAnsi="Courier New" w:hint="default"/>
+        <w:sz w:val="20"/>
+      </w:rPr>
+    </w:lvl>
+    <w:lvl w:ilvl="2" w:tentative="1">
+      <w:start w:val="1"/>
+      <w:numFmt w:val="bullet"/>
+      <w:lvlText w:val=""/>
+      <w:lvlJc w:val="left"/>
+      <w:pPr>
+        <w:tabs>
+          <w:tab w:val="num" w:pos="2160"/>
+        </w:tabs>
+        <w:ind w:left="2160" w:hanging="360"/>
+      </w:pPr>
+      <w:rPr>
+        <w:rFonts w:ascii="Wingdings" w:hAnsi="Wingdings" w:hint="default"/>
+        <w:sz w:val="20"/>
+      </w:rPr>
+    </w:lvl>
+    <w:lvl w:ilvl="3" w:tentative="1">
+      <w:start w:val="1"/>
+      <w:numFmt w:val="bullet"/>
+      <w:lvlText w:val=""/>
+      <w:lvlJc w:val="left"/>
+      <w:pPr>
+        <w:tabs>
+          <w:tab w:val="num" w:pos="2880"/>
+        </w:tabs>
+        <w:ind w:left="2880" w:hanging="360"/>
+      </w:pPr>
+      <w:rPr>
+        <w:rFonts w:ascii="Wingdings" w:hAnsi="Wingdings" w:hint="default"/>
+        <w:sz w:val="20"/>
+      </w:rPr>
+    </w:lvl>
+    <w:lvl w:ilvl="4" w:tentative="1">
+      <w:start w:val="1"/>
+      <w:numFmt w:val="bullet"/>
+      <w:lvlText w:val=""/>
+      <w:lvlJc w:val="left"/>
+      <w:pPr>
+        <w:tabs>
+          <w:tab w:val="num" w:pos="3600"/>
+        </w:tabs>
+        <w:ind w:left="3600" w:hanging="360"/>
+      </w:pPr>
+      <w:rPr>
+        <w:rFonts w:ascii="Wingdings" w:hAnsi="Wingdings" w:hint="default"/>
+        <w:sz w:val="20"/>
+      </w:rPr>
+    </w:lvl>
+    <w:lvl w:ilvl="5" w:tentative="1">
+      <w:start w:val="1"/>
+      <w:numFmt w:val="bullet"/>
+      <w:lvlText w:val=""/>
+      <w:lvlJc w:val="left"/>
+      <w:pPr>
+        <w:tabs>
+          <w:tab w:val="num" w:pos="4320"/>
+        </w:tabs>
+        <w:ind w:left="4320" w:hanging="360"/>
+      </w:pPr>
+      <w:rPr>
+        <w:rFonts w:ascii="Wingdings" w:hAnsi="Wingdings" w:hint="default"/>
+        <w:sz w:val="20"/>
+      </w:rPr>
+    </w:lvl>
+    <w:lvl w:ilvl="6" w:tentative="1">
+      <w:start w:val="1"/>
+      <w:numFmt w:val="bullet"/>
+      <w:lvlText w:val=""/>
+      <w:lvlJc w:val="left"/>
+      <w:pPr>
+        <w:tabs>
+          <w:tab w:val="num" w:pos="5040"/>
+        </w:tabs>
+        <w:ind w:left="5040" w:hanging="360"/>
+      </w:pPr>
+      <w:rPr>
+        <w:rFonts w:ascii="Wingdings" w:hAnsi="Wingdings" w:hint="default"/>
+        <w:sz w:val="20"/>
+      </w:rPr>
+    </w:lvl>
+    <w:lvl w:ilvl="7" w:tentative="1">
+      <w:start w:val="1"/>
+      <w:numFmt w:val="bullet"/>
+      <w:lvlText w:val=""/>
+      <w:lvlJc w:val="left"/>
+      <w:pPr>
+        <w:tabs>
+          <w:tab w:val="num" w:pos="5760"/>
+        </w:tabs>
+        <w:ind w:left="5760" w:hanging="360"/>
+      </w:pPr>
+      <w:rPr>
+        <w:rFonts w:ascii="Wingdings" w:hAnsi="Wingdings" w:hint="default"/>
+        <w:sz w:val="20"/>
+      </w:rPr>
+    </w:lvl>
+    <w:lvl w:ilvl="8" w:tentative="1">
+      <w:start w:val="1"/>
+      <w:numFmt w:val="bullet"/>
+      <w:lvlText w:val=""/>
+      <w:lvlJc w:val="left"/>
+      <w:pPr>
+        <w:tabs>
+          <w:tab w:val="num" w:pos="6480"/>
+        </w:tabs>
+        <w:ind w:left="6480" w:hanging="360"/>
+      </w:pPr>
+      <w:rPr>
+        <w:rFonts w:ascii="Wingdings" w:hAnsi="Wingdings" w:hint="default"/>
+        <w:sz w:val="20"/>
+      </w:rPr>
+    </w:lvl>
+  </w:abstractNum>
+  <w:abstractNum w:abstractNumId="13" w15:restartNumberingAfterBreak="0">
     <w:nsid w:val="26467C7D"/>
     <w:multiLevelType w:val="multilevel"/>
     <w:tmpl w:val="201AD2DE"/>
@@ -20921,7 +21965,7 @@
       </w:rPr>
     </w:lvl>
   </w:abstractNum>
-  <w:abstractNum w:abstractNumId="12" w15:restartNumberingAfterBreak="0">
+  <w:abstractNum w:abstractNumId="14" w15:restartNumberingAfterBreak="0">
     <w:nsid w:val="28D22C56"/>
     <w:multiLevelType w:val="multilevel"/>
     <w:tmpl w:val="10665D16"/>
@@ -21070,7 +22114,7 @@
       </w:rPr>
     </w:lvl>
   </w:abstractNum>
-  <w:abstractNum w:abstractNumId="13" w15:restartNumberingAfterBreak="0">
+  <w:abstractNum w:abstractNumId="15" w15:restartNumberingAfterBreak="0">
     <w:nsid w:val="2C851E90"/>
     <w:multiLevelType w:val="multilevel"/>
     <w:tmpl w:val="5FB408E6"/>
@@ -21219,7 +22263,156 @@
       </w:rPr>
     </w:lvl>
   </w:abstractNum>
-  <w:abstractNum w:abstractNumId="14" w15:restartNumberingAfterBreak="0">
+  <w:abstractNum w:abstractNumId="16" w15:restartNumberingAfterBreak="0">
+    <w:nsid w:val="3017271A"/>
+    <w:multiLevelType w:val="multilevel"/>
+    <w:tmpl w:val="905A533A"/>
+    <w:lvl w:ilvl="0">
+      <w:start w:val="1"/>
+      <w:numFmt w:val="bullet"/>
+      <w:lvlText w:val=""/>
+      <w:lvlJc w:val="left"/>
+      <w:pPr>
+        <w:tabs>
+          <w:tab w:val="num" w:pos="720"/>
+        </w:tabs>
+        <w:ind w:left="720" w:hanging="360"/>
+      </w:pPr>
+      <w:rPr>
+        <w:rFonts w:ascii="Symbol" w:hAnsi="Symbol" w:hint="default"/>
+        <w:sz w:val="20"/>
+      </w:rPr>
+    </w:lvl>
+    <w:lvl w:ilvl="1" w:tentative="1">
+      <w:start w:val="1"/>
+      <w:numFmt w:val="bullet"/>
+      <w:lvlText w:val="o"/>
+      <w:lvlJc w:val="left"/>
+      <w:pPr>
+        <w:tabs>
+          <w:tab w:val="num" w:pos="1440"/>
+        </w:tabs>
+        <w:ind w:left="1440" w:hanging="360"/>
+      </w:pPr>
+      <w:rPr>
+        <w:rFonts w:ascii="Courier New" w:hAnsi="Courier New" w:hint="default"/>
+        <w:sz w:val="20"/>
+      </w:rPr>
+    </w:lvl>
+    <w:lvl w:ilvl="2" w:tentative="1">
+      <w:start w:val="1"/>
+      <w:numFmt w:val="bullet"/>
+      <w:lvlText w:val=""/>
+      <w:lvlJc w:val="left"/>
+      <w:pPr>
+        <w:tabs>
+          <w:tab w:val="num" w:pos="2160"/>
+        </w:tabs>
+        <w:ind w:left="2160" w:hanging="360"/>
+      </w:pPr>
+      <w:rPr>
+        <w:rFonts w:ascii="Wingdings" w:hAnsi="Wingdings" w:hint="default"/>
+        <w:sz w:val="20"/>
+      </w:rPr>
+    </w:lvl>
+    <w:lvl w:ilvl="3" w:tentative="1">
+      <w:start w:val="1"/>
+      <w:numFmt w:val="bullet"/>
+      <w:lvlText w:val=""/>
+      <w:lvlJc w:val="left"/>
+      <w:pPr>
+        <w:tabs>
+          <w:tab w:val="num" w:pos="2880"/>
+        </w:tabs>
+        <w:ind w:left="2880" w:hanging="360"/>
+      </w:pPr>
+      <w:rPr>
+        <w:rFonts w:ascii="Wingdings" w:hAnsi="Wingdings" w:hint="default"/>
+        <w:sz w:val="20"/>
+      </w:rPr>
+    </w:lvl>
+    <w:lvl w:ilvl="4" w:tentative="1">
+      <w:start w:val="1"/>
+      <w:numFmt w:val="bullet"/>
+      <w:lvlText w:val=""/>
+      <w:lvlJc w:val="left"/>
+      <w:pPr>
+        <w:tabs>
+          <w:tab w:val="num" w:pos="3600"/>
+        </w:tabs>
+        <w:ind w:left="3600" w:hanging="360"/>
+      </w:pPr>
+      <w:rPr>
+        <w:rFonts w:ascii="Wingdings" w:hAnsi="Wingdings" w:hint="default"/>
+        <w:sz w:val="20"/>
+      </w:rPr>
+    </w:lvl>
+    <w:lvl w:ilvl="5" w:tentative="1">
+      <w:start w:val="1"/>
+      <w:numFmt w:val="bullet"/>
+      <w:lvlText w:val=""/>
+      <w:lvlJc w:val="left"/>
+      <w:pPr>
+        <w:tabs>
+          <w:tab w:val="num" w:pos="4320"/>
+        </w:tabs>
+        <w:ind w:left="4320" w:hanging="360"/>
+      </w:pPr>
+      <w:rPr>
+        <w:rFonts w:ascii="Wingdings" w:hAnsi="Wingdings" w:hint="default"/>
+        <w:sz w:val="20"/>
+      </w:rPr>
+    </w:lvl>
+    <w:lvl w:ilvl="6" w:tentative="1">
+      <w:start w:val="1"/>
+      <w:numFmt w:val="bullet"/>
+      <w:lvlText w:val=""/>
+      <w:lvlJc w:val="left"/>
+      <w:pPr>
+        <w:tabs>
+          <w:tab w:val="num" w:pos="5040"/>
+        </w:tabs>
+        <w:ind w:left="5040" w:hanging="360"/>
+      </w:pPr>
+      <w:rPr>
+        <w:rFonts w:ascii="Wingdings" w:hAnsi="Wingdings" w:hint="default"/>
+        <w:sz w:val="20"/>
+      </w:rPr>
+    </w:lvl>
+    <w:lvl w:ilvl="7" w:tentative="1">
+      <w:start w:val="1"/>
+      <w:numFmt w:val="bullet"/>
+      <w:lvlText w:val=""/>
+      <w:lvlJc w:val="left"/>
+      <w:pPr>
+        <w:tabs>
+          <w:tab w:val="num" w:pos="5760"/>
+        </w:tabs>
+        <w:ind w:left="5760" w:hanging="360"/>
+      </w:pPr>
+      <w:rPr>
+        <w:rFonts w:ascii="Wingdings" w:hAnsi="Wingdings" w:hint="default"/>
+        <w:sz w:val="20"/>
+      </w:rPr>
+    </w:lvl>
+    <w:lvl w:ilvl="8" w:tentative="1">
+      <w:start w:val="1"/>
+      <w:numFmt w:val="bullet"/>
+      <w:lvlText w:val=""/>
+      <w:lvlJc w:val="left"/>
+      <w:pPr>
+        <w:tabs>
+          <w:tab w:val="num" w:pos="6480"/>
+        </w:tabs>
+        <w:ind w:left="6480" w:hanging="360"/>
+      </w:pPr>
+      <w:rPr>
+        <w:rFonts w:ascii="Wingdings" w:hAnsi="Wingdings" w:hint="default"/>
+        <w:sz w:val="20"/>
+      </w:rPr>
+    </w:lvl>
+  </w:abstractNum>
+  <w:abstractNum w:abstractNumId="17" w15:restartNumberingAfterBreak="0">
     <w:nsid w:val="338B091C"/>
     <w:multiLevelType w:val="multilevel"/>
     <w:tmpl w:val="383E1138"/>
@@ -21368,7 +22561,7 @@
       </w:rPr>
     </w:lvl>
   </w:abstractNum>
-  <w:abstractNum w:abstractNumId="15" w15:restartNumberingAfterBreak="0">
+  <w:abstractNum w:abstractNumId="18" w15:restartNumberingAfterBreak="0">
     <w:nsid w:val="3996735D"/>
     <w:multiLevelType w:val="multilevel"/>
     <w:tmpl w:val="0E680CE6"/>
@@ -21517,7 +22710,7 @@
       </w:rPr>
     </w:lvl>
   </w:abstractNum>
-  <w:abstractNum w:abstractNumId="16" w15:restartNumberingAfterBreak="0">
+  <w:abstractNum w:abstractNumId="19" w15:restartNumberingAfterBreak="0">
     <w:nsid w:val="3B933580"/>
     <w:multiLevelType w:val="multilevel"/>
     <w:tmpl w:val="63D8CD4A"/>
@@ -21666,7 +22859,7 @@
       </w:rPr>
     </w:lvl>
   </w:abstractNum>
-  <w:abstractNum w:abstractNumId="17" w15:restartNumberingAfterBreak="0">
+  <w:abstractNum w:abstractNumId="20" w15:restartNumberingAfterBreak="0">
     <w:nsid w:val="406F28B0"/>
     <w:multiLevelType w:val="multilevel"/>
     <w:tmpl w:val="65E8EE06"/>
@@ -21815,7 +23008,7 @@
       </w:rPr>
     </w:lvl>
   </w:abstractNum>
-  <w:abstractNum w:abstractNumId="18" w15:restartNumberingAfterBreak="0">
+  <w:abstractNum w:abstractNumId="21" w15:restartNumberingAfterBreak="0">
     <w:nsid w:val="42E45AF3"/>
     <w:multiLevelType w:val="multilevel"/>
     <w:tmpl w:val="E498492A"/>
@@ -21964,7 +23157,156 @@
       </w:rPr>
     </w:lvl>
   </w:abstractNum>
-  <w:abstractNum w:abstractNumId="19" w15:restartNumberingAfterBreak="0">
+  <w:abstractNum w:abstractNumId="22" w15:restartNumberingAfterBreak="0">
+    <w:nsid w:val="44E70EE6"/>
+    <w:multiLevelType w:val="multilevel"/>
+    <w:tmpl w:val="881077A4"/>
+    <w:lvl w:ilvl="0">
+      <w:start w:val="1"/>
+      <w:numFmt w:val="bullet"/>
+      <w:lvlText w:val=""/>
+      <w:lvlJc w:val="left"/>
+      <w:pPr>
+        <w:tabs>
+          <w:tab w:val="num" w:pos="720"/>
+        </w:tabs>
+        <w:ind w:left="720" w:hanging="360"/>
+      </w:pPr>
+      <w:rPr>
+        <w:rFonts w:ascii="Symbol" w:hAnsi="Symbol" w:hint="default"/>
+        <w:sz w:val="20"/>
+      </w:rPr>
+    </w:lvl>
+    <w:lvl w:ilvl="1" w:tentative="1">
+      <w:start w:val="1"/>
+      <w:numFmt w:val="bullet"/>
+      <w:lvlText w:val="o"/>
+      <w:lvlJc w:val="left"/>
+      <w:pPr>
+        <w:tabs>
+          <w:tab w:val="num" w:pos="1440"/>
+        </w:tabs>
+        <w:ind w:left="1440" w:hanging="360"/>
+      </w:pPr>
+      <w:rPr>
+        <w:rFonts w:ascii="Courier New" w:hAnsi="Courier New" w:hint="default"/>
+        <w:sz w:val="20"/>
+      </w:rPr>
+    </w:lvl>
+    <w:lvl w:ilvl="2" w:tentative="1">
+      <w:start w:val="1"/>
+      <w:numFmt w:val="bullet"/>
+      <w:lvlText w:val=""/>
+      <w:lvlJc w:val="left"/>
+      <w:pPr>
+        <w:tabs>
+          <w:tab w:val="num" w:pos="2160"/>
+        </w:tabs>
+        <w:ind w:left="2160" w:hanging="360"/>
+      </w:pPr>
+      <w:rPr>
+        <w:rFonts w:ascii="Wingdings" w:hAnsi="Wingdings" w:hint="default"/>
+        <w:sz w:val="20"/>
+      </w:rPr>
+    </w:lvl>
+    <w:lvl w:ilvl="3" w:tentative="1">
+      <w:start w:val="1"/>
+      <w:numFmt w:val="bullet"/>
+      <w:lvlText w:val=""/>
+      <w:lvlJc w:val="left"/>
+      <w:pPr>
+        <w:tabs>
+          <w:tab w:val="num" w:pos="2880"/>
+        </w:tabs>
+        <w:ind w:left="2880" w:hanging="360"/>
+      </w:pPr>
+      <w:rPr>
+        <w:rFonts w:ascii="Wingdings" w:hAnsi="Wingdings" w:hint="default"/>
+        <w:sz w:val="20"/>
+      </w:rPr>
+    </w:lvl>
+    <w:lvl w:ilvl="4" w:tentative="1">
+      <w:start w:val="1"/>
+      <w:numFmt w:val="bullet"/>
+      <w:lvlText w:val=""/>
+      <w:lvlJc w:val="left"/>
+      <w:pPr>
+        <w:tabs>
+          <w:tab w:val="num" w:pos="3600"/>
+        </w:tabs>
+        <w:ind w:left="3600" w:hanging="360"/>
+      </w:pPr>
+      <w:rPr>
+        <w:rFonts w:ascii="Wingdings" w:hAnsi="Wingdings" w:hint="default"/>
+        <w:sz w:val="20"/>
+      </w:rPr>
+    </w:lvl>
+    <w:lvl w:ilvl="5" w:tentative="1">
+      <w:start w:val="1"/>
+      <w:numFmt w:val="bullet"/>
+      <w:lvlText w:val=""/>
+      <w:lvlJc w:val="left"/>
+      <w:pPr>
+        <w:tabs>
+          <w:tab w:val="num" w:pos="4320"/>
+        </w:tabs>
+        <w:ind w:left="4320" w:hanging="360"/>
+      </w:pPr>
+      <w:rPr>
+        <w:rFonts w:ascii="Wingdings" w:hAnsi="Wingdings" w:hint="default"/>
+        <w:sz w:val="20"/>
+      </w:rPr>
+    </w:lvl>
+    <w:lvl w:ilvl="6" w:tentative="1">
+      <w:start w:val="1"/>
+      <w:numFmt w:val="bullet"/>
+      <w:lvlText w:val=""/>
+      <w:lvlJc w:val="left"/>
+      <w:pPr>
+        <w:tabs>
+          <w:tab w:val="num" w:pos="5040"/>
+        </w:tabs>
+        <w:ind w:left="5040" w:hanging="360"/>
+      </w:pPr>
+      <w:rPr>
+        <w:rFonts w:ascii="Wingdings" w:hAnsi="Wingdings" w:hint="default"/>
+        <w:sz w:val="20"/>
+      </w:rPr>
+    </w:lvl>
+    <w:lvl w:ilvl="7" w:tentative="1">
+      <w:start w:val="1"/>
+      <w:numFmt w:val="bullet"/>
+      <w:lvlText w:val=""/>
+      <w:lvlJc w:val="left"/>
+      <w:pPr>
+        <w:tabs>
+          <w:tab w:val="num" w:pos="5760"/>
+        </w:tabs>
+        <w:ind w:left="5760" w:hanging="360"/>
+      </w:pPr>
+      <w:rPr>
+        <w:rFonts w:ascii="Wingdings" w:hAnsi="Wingdings" w:hint="default"/>
+        <w:sz w:val="20"/>
+      </w:rPr>
+    </w:lvl>
+    <w:lvl w:ilvl="8" w:tentative="1">
+      <w:start w:val="1"/>
+      <w:numFmt w:val="bullet"/>
+      <w:lvlText w:val=""/>
+      <w:lvlJc w:val="left"/>
+      <w:pPr>
+        <w:tabs>
+          <w:tab w:val="num" w:pos="6480"/>
+        </w:tabs>
+        <w:ind w:left="6480" w:hanging="360"/>
+      </w:pPr>
+      <w:rPr>
+        <w:rFonts w:ascii="Wingdings" w:hAnsi="Wingdings" w:hint="default"/>
+        <w:sz w:val="20"/>
+      </w:rPr>
+    </w:lvl>
+  </w:abstractNum>
+  <w:abstractNum w:abstractNumId="23" w15:restartNumberingAfterBreak="0">
     <w:nsid w:val="47332AE8"/>
     <w:multiLevelType w:val="multilevel"/>
     <w:tmpl w:val="672EA8A6"/>
@@ -22113,7 +23455,7 @@
       </w:rPr>
     </w:lvl>
   </w:abstractNum>
-  <w:abstractNum w:abstractNumId="20" w15:restartNumberingAfterBreak="0">
+  <w:abstractNum w:abstractNumId="24" w15:restartNumberingAfterBreak="0">
     <w:nsid w:val="47B12446"/>
     <w:multiLevelType w:val="multilevel"/>
     <w:tmpl w:val="AFD65C12"/>
@@ -22262,7 +23604,7 @@
       </w:rPr>
     </w:lvl>
   </w:abstractNum>
-  <w:abstractNum w:abstractNumId="21" w15:restartNumberingAfterBreak="0">
+  <w:abstractNum w:abstractNumId="25" w15:restartNumberingAfterBreak="0">
     <w:nsid w:val="47E31ACF"/>
     <w:multiLevelType w:val="multilevel"/>
     <w:tmpl w:val="4ABA4D08"/>
@@ -22411,7 +23753,7 @@
       </w:rPr>
     </w:lvl>
   </w:abstractNum>
-  <w:abstractNum w:abstractNumId="22" w15:restartNumberingAfterBreak="0">
+  <w:abstractNum w:abstractNumId="26" w15:restartNumberingAfterBreak="0">
     <w:nsid w:val="4D9C1476"/>
     <w:multiLevelType w:val="multilevel"/>
     <w:tmpl w:val="3712F9BE"/>
@@ -22560,7 +23902,7 @@
       </w:rPr>
     </w:lvl>
   </w:abstractNum>
-  <w:abstractNum w:abstractNumId="23" w15:restartNumberingAfterBreak="0">
+  <w:abstractNum w:abstractNumId="27" w15:restartNumberingAfterBreak="0">
     <w:nsid w:val="50575291"/>
     <w:multiLevelType w:val="multilevel"/>
     <w:tmpl w:val="AC666B9C"/>
@@ -22709,7 +24051,7 @@
       </w:rPr>
     </w:lvl>
   </w:abstractNum>
-  <w:abstractNum w:abstractNumId="24" w15:restartNumberingAfterBreak="0">
+  <w:abstractNum w:abstractNumId="28" w15:restartNumberingAfterBreak="0">
     <w:nsid w:val="530D6604"/>
     <w:multiLevelType w:val="multilevel"/>
     <w:tmpl w:val="0248FF20"/>
@@ -22858,7 +24200,7 @@
       </w:rPr>
     </w:lvl>
   </w:abstractNum>
-  <w:abstractNum w:abstractNumId="25" w15:restartNumberingAfterBreak="0">
+  <w:abstractNum w:abstractNumId="29" w15:restartNumberingAfterBreak="0">
     <w:nsid w:val="54E23773"/>
     <w:multiLevelType w:val="multilevel"/>
     <w:tmpl w:val="F7181842"/>
@@ -23007,7 +24349,7 @@
       </w:rPr>
     </w:lvl>
   </w:abstractNum>
-  <w:abstractNum w:abstractNumId="26" w15:restartNumberingAfterBreak="0">
+  <w:abstractNum w:abstractNumId="30" w15:restartNumberingAfterBreak="0">
     <w:nsid w:val="5AB1749A"/>
     <w:multiLevelType w:val="multilevel"/>
     <w:tmpl w:val="178A833C"/>
@@ -23156,7 +24498,7 @@
       </w:rPr>
     </w:lvl>
   </w:abstractNum>
-  <w:abstractNum w:abstractNumId="27" w15:restartNumberingAfterBreak="0">
+  <w:abstractNum w:abstractNumId="31" w15:restartNumberingAfterBreak="0">
     <w:nsid w:val="5B7979E7"/>
     <w:multiLevelType w:val="multilevel"/>
     <w:tmpl w:val="DA58E8A2"/>
@@ -23305,7 +24647,7 @@
       </w:rPr>
     </w:lvl>
   </w:abstractNum>
-  <w:abstractNum w:abstractNumId="28" w15:restartNumberingAfterBreak="0">
+  <w:abstractNum w:abstractNumId="32" w15:restartNumberingAfterBreak="0">
     <w:nsid w:val="5BF46F7A"/>
     <w:multiLevelType w:val="multilevel"/>
     <w:tmpl w:val="C6DC5C26"/>
@@ -23454,7 +24796,156 @@
       </w:rPr>
     </w:lvl>
   </w:abstractNum>
-  <w:abstractNum w:abstractNumId="29" w15:restartNumberingAfterBreak="0">
+  <w:abstractNum w:abstractNumId="33" w15:restartNumberingAfterBreak="0">
+    <w:nsid w:val="5CDE7E2D"/>
+    <w:multiLevelType w:val="multilevel"/>
+    <w:tmpl w:val="9EEE7790"/>
+    <w:lvl w:ilvl="0">
+      <w:start w:val="1"/>
+      <w:numFmt w:val="bullet"/>
+      <w:lvlText w:val=""/>
+      <w:lvlJc w:val="left"/>
+      <w:pPr>
+        <w:tabs>
+          <w:tab w:val="num" w:pos="720"/>
+        </w:tabs>
+        <w:ind w:left="720" w:hanging="360"/>
+      </w:pPr>
+      <w:rPr>
+        <w:rFonts w:ascii="Symbol" w:hAnsi="Symbol" w:hint="default"/>
+        <w:sz w:val="20"/>
+      </w:rPr>
+    </w:lvl>
+    <w:lvl w:ilvl="1" w:tentative="1">
+      <w:start w:val="1"/>
+      <w:numFmt w:val="bullet"/>
+      <w:lvlText w:val="o"/>
+      <w:lvlJc w:val="left"/>
+      <w:pPr>
+        <w:tabs>
+          <w:tab w:val="num" w:pos="1440"/>
+        </w:tabs>
+        <w:ind w:left="1440" w:hanging="360"/>
+      </w:pPr>
+      <w:rPr>
+        <w:rFonts w:ascii="Courier New" w:hAnsi="Courier New" w:hint="default"/>
+        <w:sz w:val="20"/>
+      </w:rPr>
+    </w:lvl>
+    <w:lvl w:ilvl="2" w:tentative="1">
+      <w:start w:val="1"/>
+      <w:numFmt w:val="bullet"/>
+      <w:lvlText w:val=""/>
+      <w:lvlJc w:val="left"/>
+      <w:pPr>
+        <w:tabs>
+          <w:tab w:val="num" w:pos="2160"/>
+        </w:tabs>
+        <w:ind w:left="2160" w:hanging="360"/>
+      </w:pPr>
+      <w:rPr>
+        <w:rFonts w:ascii="Wingdings" w:hAnsi="Wingdings" w:hint="default"/>
+        <w:sz w:val="20"/>
+      </w:rPr>
+    </w:lvl>
+    <w:lvl w:ilvl="3" w:tentative="1">
+      <w:start w:val="1"/>
+      <w:numFmt w:val="bullet"/>
+      <w:lvlText w:val=""/>
+      <w:lvlJc w:val="left"/>
+      <w:pPr>
+        <w:tabs>
+          <w:tab w:val="num" w:pos="2880"/>
+        </w:tabs>
+        <w:ind w:left="2880" w:hanging="360"/>
+      </w:pPr>
+      <w:rPr>
+        <w:rFonts w:ascii="Wingdings" w:hAnsi="Wingdings" w:hint="default"/>
+        <w:sz w:val="20"/>
+      </w:rPr>
+    </w:lvl>
+    <w:lvl w:ilvl="4" w:tentative="1">
+      <w:start w:val="1"/>
+      <w:numFmt w:val="bullet"/>
+      <w:lvlText w:val=""/>
+      <w:lvlJc w:val="left"/>
+      <w:pPr>
+        <w:tabs>
+          <w:tab w:val="num" w:pos="3600"/>
+        </w:tabs>
+        <w:ind w:left="3600" w:hanging="360"/>
+      </w:pPr>
+      <w:rPr>
+        <w:rFonts w:ascii="Wingdings" w:hAnsi="Wingdings" w:hint="default"/>
+        <w:sz w:val="20"/>
+      </w:rPr>
+    </w:lvl>
+    <w:lvl w:ilvl="5" w:tentative="1">
+      <w:start w:val="1"/>
+      <w:numFmt w:val="bullet"/>
+      <w:lvlText w:val=""/>
+      <w:lvlJc w:val="left"/>
+      <w:pPr>
+        <w:tabs>
+          <w:tab w:val="num" w:pos="4320"/>
+        </w:tabs>
+        <w:ind w:left="4320" w:hanging="360"/>
+      </w:pPr>
+      <w:rPr>
+        <w:rFonts w:ascii="Wingdings" w:hAnsi="Wingdings" w:hint="default"/>
+        <w:sz w:val="20"/>
+      </w:rPr>
+    </w:lvl>
+    <w:lvl w:ilvl="6" w:tentative="1">
+      <w:start w:val="1"/>
+      <w:numFmt w:val="bullet"/>
+      <w:lvlText w:val=""/>
+      <w:lvlJc w:val="left"/>
+      <w:pPr>
+        <w:tabs>
+          <w:tab w:val="num" w:pos="5040"/>
+        </w:tabs>
+        <w:ind w:left="5040" w:hanging="360"/>
+      </w:pPr>
+      <w:rPr>
+        <w:rFonts w:ascii="Wingdings" w:hAnsi="Wingdings" w:hint="default"/>
+        <w:sz w:val="20"/>
+      </w:rPr>
+    </w:lvl>
+    <w:lvl w:ilvl="7" w:tentative="1">
+      <w:start w:val="1"/>
+      <w:numFmt w:val="bullet"/>
+      <w:lvlText w:val=""/>
+      <w:lvlJc w:val="left"/>
+      <w:pPr>
+        <w:tabs>
+          <w:tab w:val="num" w:pos="5760"/>
+        </w:tabs>
+        <w:ind w:left="5760" w:hanging="360"/>
+      </w:pPr>
+      <w:rPr>
+        <w:rFonts w:ascii="Wingdings" w:hAnsi="Wingdings" w:hint="default"/>
+        <w:sz w:val="20"/>
+      </w:rPr>
+    </w:lvl>
+    <w:lvl w:ilvl="8" w:tentative="1">
+      <w:start w:val="1"/>
+      <w:numFmt w:val="bullet"/>
+      <w:lvlText w:val=""/>
+      <w:lvlJc w:val="left"/>
+      <w:pPr>
+        <w:tabs>
+          <w:tab w:val="num" w:pos="6480"/>
+        </w:tabs>
+        <w:ind w:left="6480" w:hanging="360"/>
+      </w:pPr>
+      <w:rPr>
+        <w:rFonts w:ascii="Wingdings" w:hAnsi="Wingdings" w:hint="default"/>
+        <w:sz w:val="20"/>
+      </w:rPr>
+    </w:lvl>
+  </w:abstractNum>
+  <w:abstractNum w:abstractNumId="34" w15:restartNumberingAfterBreak="0">
     <w:nsid w:val="6062505D"/>
     <w:multiLevelType w:val="multilevel"/>
     <w:tmpl w:val="9CC26A56"/>
@@ -23603,7 +25094,7 @@
       </w:rPr>
     </w:lvl>
   </w:abstractNum>
-  <w:abstractNum w:abstractNumId="30" w15:restartNumberingAfterBreak="0">
+  <w:abstractNum w:abstractNumId="35" w15:restartNumberingAfterBreak="0">
     <w:nsid w:val="608E7EED"/>
     <w:multiLevelType w:val="multilevel"/>
     <w:tmpl w:val="3B220EFC"/>
@@ -23752,7 +25243,7 @@
       </w:rPr>
     </w:lvl>
   </w:abstractNum>
-  <w:abstractNum w:abstractNumId="31" w15:restartNumberingAfterBreak="0">
+  <w:abstractNum w:abstractNumId="36" w15:restartNumberingAfterBreak="0">
     <w:nsid w:val="615A0D22"/>
     <w:multiLevelType w:val="multilevel"/>
     <w:tmpl w:val="10701B0A"/>
@@ -23901,7 +25392,7 @@
       </w:rPr>
     </w:lvl>
   </w:abstractNum>
-  <w:abstractNum w:abstractNumId="32" w15:restartNumberingAfterBreak="0">
+  <w:abstractNum w:abstractNumId="37" w15:restartNumberingAfterBreak="0">
     <w:nsid w:val="65320D8E"/>
     <w:multiLevelType w:val="multilevel"/>
     <w:tmpl w:val="4B42ADD8"/>
@@ -24050,7 +25541,7 @@
       </w:rPr>
     </w:lvl>
   </w:abstractNum>
-  <w:abstractNum w:abstractNumId="33" w15:restartNumberingAfterBreak="0">
+  <w:abstractNum w:abstractNumId="38" w15:restartNumberingAfterBreak="0">
     <w:nsid w:val="66A91E72"/>
     <w:multiLevelType w:val="multilevel"/>
     <w:tmpl w:val="49965E40"/>
@@ -24199,7 +25690,7 @@
       </w:rPr>
     </w:lvl>
   </w:abstractNum>
-  <w:abstractNum w:abstractNumId="34" w15:restartNumberingAfterBreak="0">
+  <w:abstractNum w:abstractNumId="39" w15:restartNumberingAfterBreak="0">
     <w:nsid w:val="68803C6A"/>
     <w:multiLevelType w:val="multilevel"/>
     <w:tmpl w:val="D51C2B98"/>
@@ -24348,7 +25839,7 @@
       </w:rPr>
     </w:lvl>
   </w:abstractNum>
-  <w:abstractNum w:abstractNumId="35" w15:restartNumberingAfterBreak="0">
+  <w:abstractNum w:abstractNumId="40" w15:restartNumberingAfterBreak="0">
     <w:nsid w:val="69C030A1"/>
     <w:multiLevelType w:val="multilevel"/>
     <w:tmpl w:val="04080025"/>
@@ -24443,7 +25934,7 @@
       </w:pPr>
     </w:lvl>
   </w:abstractNum>
-  <w:abstractNum w:abstractNumId="36" w15:restartNumberingAfterBreak="0">
+  <w:abstractNum w:abstractNumId="41" w15:restartNumberingAfterBreak="0">
     <w:nsid w:val="6A9D63AC"/>
     <w:multiLevelType w:val="multilevel"/>
     <w:tmpl w:val="087E4E14"/>
@@ -24592,7 +26083,7 @@
       </w:rPr>
     </w:lvl>
   </w:abstractNum>
-  <w:abstractNum w:abstractNumId="37" w15:restartNumberingAfterBreak="0">
+  <w:abstractNum w:abstractNumId="42" w15:restartNumberingAfterBreak="0">
     <w:nsid w:val="6E446A8D"/>
     <w:multiLevelType w:val="multilevel"/>
     <w:tmpl w:val="D8443F10"/>
@@ -24741,7 +26232,7 @@
       </w:rPr>
     </w:lvl>
   </w:abstractNum>
-  <w:abstractNum w:abstractNumId="38" w15:restartNumberingAfterBreak="0">
+  <w:abstractNum w:abstractNumId="43" w15:restartNumberingAfterBreak="0">
     <w:nsid w:val="6EAA3A50"/>
     <w:multiLevelType w:val="multilevel"/>
     <w:tmpl w:val="9C643778"/>
@@ -24890,7 +26381,120 @@
       </w:rPr>
     </w:lvl>
   </w:abstractNum>
-  <w:abstractNum w:abstractNumId="39" w15:restartNumberingAfterBreak="0">
+  <w:abstractNum w:abstractNumId="44" w15:restartNumberingAfterBreak="0">
+    <w:nsid w:val="6F457B13"/>
+    <w:multiLevelType w:val="multilevel"/>
+    <w:tmpl w:val="B82888E2"/>
+    <w:lvl w:ilvl="0">
+      <w:start w:val="1"/>
+      <w:numFmt w:val="decimal"/>
+      <w:lvlText w:val="%1."/>
+      <w:lvlJc w:val="left"/>
+      <w:pPr>
+        <w:tabs>
+          <w:tab w:val="num" w:pos="720"/>
+        </w:tabs>
+        <w:ind w:left="720" w:hanging="360"/>
+      </w:pPr>
+    </w:lvl>
+    <w:lvl w:ilvl="1" w:tentative="1">
+      <w:start w:val="1"/>
+      <w:numFmt w:val="decimal"/>
+      <w:lvlText w:val="%2."/>
+      <w:lvlJc w:val="left"/>
+      <w:pPr>
+        <w:tabs>
+          <w:tab w:val="num" w:pos="1440"/>
+        </w:tabs>
+        <w:ind w:left="1440" w:hanging="360"/>
+      </w:pPr>
+    </w:lvl>
+    <w:lvl w:ilvl="2" w:tentative="1">
+      <w:start w:val="1"/>
+      <w:numFmt w:val="decimal"/>
+      <w:lvlText w:val="%3."/>
+      <w:lvlJc w:val="left"/>
+      <w:pPr>
+        <w:tabs>
+          <w:tab w:val="num" w:pos="2160"/>
+        </w:tabs>
+        <w:ind w:left="2160" w:hanging="360"/>
+      </w:pPr>
+    </w:lvl>
+    <w:lvl w:ilvl="3" w:tentative="1">
+      <w:start w:val="1"/>
+      <w:numFmt w:val="decimal"/>
+      <w:lvlText w:val="%4."/>
+      <w:lvlJc w:val="left"/>
+      <w:pPr>
+        <w:tabs>
+          <w:tab w:val="num" w:pos="2880"/>
+        </w:tabs>
+        <w:ind w:left="2880" w:hanging="360"/>
+      </w:pPr>
+    </w:lvl>
+    <w:lvl w:ilvl="4" w:tentative="1">
+      <w:start w:val="1"/>
+      <w:numFmt w:val="decimal"/>
+      <w:lvlText w:val="%5."/>
+      <w:lvlJc w:val="left"/>
+      <w:pPr>
+        <w:tabs>
+          <w:tab w:val="num" w:pos="3600"/>
+        </w:tabs>
+        <w:ind w:left="3600" w:hanging="360"/>
+      </w:pPr>
+    </w:lvl>
+    <w:lvl w:ilvl="5" w:tentative="1">
+      <w:start w:val="1"/>
+      <w:numFmt w:val="decimal"/>
+      <w:lvlText w:val="%6."/>
+      <w:lvlJc w:val="left"/>
+      <w:pPr>
+        <w:tabs>
+          <w:tab w:val="num" w:pos="4320"/>
+        </w:tabs>
+        <w:ind w:left="4320" w:hanging="360"/>
+      </w:pPr>
+    </w:lvl>
+    <w:lvl w:ilvl="6" w:tentative="1">
+      <w:start w:val="1"/>
+      <w:numFmt w:val="decimal"/>
+      <w:lvlText w:val="%7."/>
+      <w:lvlJc w:val="left"/>
+      <w:pPr>
+        <w:tabs>
+          <w:tab w:val="num" w:pos="5040"/>
+        </w:tabs>
+        <w:ind w:left="5040" w:hanging="360"/>
+      </w:pPr>
+    </w:lvl>
+    <w:lvl w:ilvl="7" w:tentative="1">
+      <w:start w:val="1"/>
+      <w:numFmt w:val="decimal"/>
+      <w:lvlText w:val="%8."/>
+      <w:lvlJc w:val="left"/>
+      <w:pPr>
+        <w:tabs>
+          <w:tab w:val="num" w:pos="5760"/>
+        </w:tabs>
+        <w:ind w:left="5760" w:hanging="360"/>
+      </w:pPr>
+    </w:lvl>
+    <w:lvl w:ilvl="8" w:tentative="1">
+      <w:start w:val="1"/>
+      <w:numFmt w:val="decimal"/>
+      <w:lvlText w:val="%9."/>
+      <w:lvlJc w:val="left"/>
+      <w:pPr>
+        <w:tabs>
+          <w:tab w:val="num" w:pos="6480"/>
+        </w:tabs>
+        <w:ind w:left="6480" w:hanging="360"/>
+      </w:pPr>
+    </w:lvl>
+  </w:abstractNum>
+  <w:abstractNum w:abstractNumId="45" w15:restartNumberingAfterBreak="0">
     <w:nsid w:val="721860C5"/>
     <w:multiLevelType w:val="multilevel"/>
     <w:tmpl w:val="62303434"/>
@@ -25039,7 +26643,7 @@
       </w:rPr>
     </w:lvl>
   </w:abstractNum>
-  <w:abstractNum w:abstractNumId="40" w15:restartNumberingAfterBreak="0">
+  <w:abstractNum w:abstractNumId="46" w15:restartNumberingAfterBreak="0">
     <w:nsid w:val="72B13498"/>
     <w:multiLevelType w:val="multilevel"/>
     <w:tmpl w:val="C5AAA23E"/>
@@ -25152,7 +26756,7 @@
       </w:pPr>
     </w:lvl>
   </w:abstractNum>
-  <w:abstractNum w:abstractNumId="41" w15:restartNumberingAfterBreak="0">
+  <w:abstractNum w:abstractNumId="47" w15:restartNumberingAfterBreak="0">
     <w:nsid w:val="76526B53"/>
     <w:multiLevelType w:val="multilevel"/>
     <w:tmpl w:val="14EAAD5C"/>
@@ -25301,7 +26905,7 @@
       </w:rPr>
     </w:lvl>
   </w:abstractNum>
-  <w:abstractNum w:abstractNumId="42" w15:restartNumberingAfterBreak="0">
+  <w:abstractNum w:abstractNumId="48" w15:restartNumberingAfterBreak="0">
     <w:nsid w:val="788C7436"/>
     <w:multiLevelType w:val="multilevel"/>
     <w:tmpl w:val="0FCA0DFE"/>
@@ -25450,7 +27054,7 @@
       </w:rPr>
     </w:lvl>
   </w:abstractNum>
-  <w:abstractNum w:abstractNumId="43" w15:restartNumberingAfterBreak="0">
+  <w:abstractNum w:abstractNumId="49" w15:restartNumberingAfterBreak="0">
     <w:nsid w:val="79F62215"/>
     <w:multiLevelType w:val="multilevel"/>
     <w:tmpl w:val="6254B200"/>
@@ -25599,7 +27203,7 @@
       </w:rPr>
     </w:lvl>
   </w:abstractNum>
-  <w:abstractNum w:abstractNumId="44" w15:restartNumberingAfterBreak="0">
+  <w:abstractNum w:abstractNumId="50" w15:restartNumberingAfterBreak="0">
     <w:nsid w:val="7E7B0B6A"/>
     <w:multiLevelType w:val="multilevel"/>
     <w:tmpl w:val="2E26B412"/>
@@ -25712,7 +27316,7 @@
       </w:pPr>
     </w:lvl>
   </w:abstractNum>
-  <w:abstractNum w:abstractNumId="45" w15:restartNumberingAfterBreak="0">
+  <w:abstractNum w:abstractNumId="51" w15:restartNumberingAfterBreak="0">
     <w:nsid w:val="7ED22321"/>
     <w:multiLevelType w:val="multilevel"/>
     <w:tmpl w:val="DC9E5872"/>
@@ -25862,142 +27466,160 @@
     </w:lvl>
   </w:abstractNum>
   <w:num w:numId="1" w16cid:durableId="334113835">
+    <w:abstractNumId w:val="45"/>
+  </w:num>
+  <w:num w:numId="2" w16cid:durableId="126432109">
+    <w:abstractNumId w:val="19"/>
+  </w:num>
+  <w:num w:numId="3" w16cid:durableId="1314287787">
+    <w:abstractNumId w:val="5"/>
+  </w:num>
+  <w:num w:numId="4" w16cid:durableId="547038218">
+    <w:abstractNumId w:val="13"/>
+  </w:num>
+  <w:num w:numId="5" w16cid:durableId="1539199328">
+    <w:abstractNumId w:val="26"/>
+  </w:num>
+  <w:num w:numId="6" w16cid:durableId="1626622690">
+    <w:abstractNumId w:val="10"/>
+  </w:num>
+  <w:num w:numId="7" w16cid:durableId="173617801">
+    <w:abstractNumId w:val="9"/>
+  </w:num>
+  <w:num w:numId="8" w16cid:durableId="98642267">
+    <w:abstractNumId w:val="48"/>
+  </w:num>
+  <w:num w:numId="9" w16cid:durableId="1998459187">
+    <w:abstractNumId w:val="34"/>
+  </w:num>
+  <w:num w:numId="10" w16cid:durableId="1645505033">
+    <w:abstractNumId w:val="50"/>
+  </w:num>
+  <w:num w:numId="11" w16cid:durableId="963392691">
+    <w:abstractNumId w:val="2"/>
+  </w:num>
+  <w:num w:numId="12" w16cid:durableId="1687051846">
+    <w:abstractNumId w:val="40"/>
+  </w:num>
+  <w:num w:numId="13" w16cid:durableId="1689679590">
+    <w:abstractNumId w:val="46"/>
+  </w:num>
+  <w:num w:numId="14" w16cid:durableId="1633435425">
+    <w:abstractNumId w:val="37"/>
+  </w:num>
+  <w:num w:numId="15" w16cid:durableId="879627401">
+    <w:abstractNumId w:val="7"/>
+  </w:num>
+  <w:num w:numId="16" w16cid:durableId="484785044">
+    <w:abstractNumId w:val="6"/>
+  </w:num>
+  <w:num w:numId="17" w16cid:durableId="105541229">
+    <w:abstractNumId w:val="28"/>
+  </w:num>
+  <w:num w:numId="18" w16cid:durableId="875199095">
+    <w:abstractNumId w:val="14"/>
+  </w:num>
+  <w:num w:numId="19" w16cid:durableId="1555239194">
+    <w:abstractNumId w:val="42"/>
+  </w:num>
+  <w:num w:numId="20" w16cid:durableId="1489859180">
+    <w:abstractNumId w:val="36"/>
+  </w:num>
+  <w:num w:numId="21" w16cid:durableId="504982169">
+    <w:abstractNumId w:val="47"/>
+  </w:num>
+  <w:num w:numId="22" w16cid:durableId="996422384">
+    <w:abstractNumId w:val="23"/>
+  </w:num>
+  <w:num w:numId="23" w16cid:durableId="1601522832">
+    <w:abstractNumId w:val="27"/>
+  </w:num>
+  <w:num w:numId="24" w16cid:durableId="1982881947">
     <w:abstractNumId w:val="39"/>
   </w:num>
-  <w:num w:numId="2" w16cid:durableId="126432109">
-    <w:abstractNumId w:val="16"/>
+  <w:num w:numId="25" w16cid:durableId="1470974799">
+    <w:abstractNumId w:val="8"/>
   </w:num>
-  <w:num w:numId="3" w16cid:durableId="1314287787">
+  <w:num w:numId="26" w16cid:durableId="2083482799">
+    <w:abstractNumId w:val="30"/>
+  </w:num>
+  <w:num w:numId="27" w16cid:durableId="482284611">
+    <w:abstractNumId w:val="21"/>
+  </w:num>
+  <w:num w:numId="28" w16cid:durableId="1783381712">
     <w:abstractNumId w:val="4"/>
   </w:num>
-  <w:num w:numId="4" w16cid:durableId="547038218">
-    <w:abstractNumId w:val="11"/>
+  <w:num w:numId="29" w16cid:durableId="1077090791">
+    <w:abstractNumId w:val="43"/>
   </w:num>
-  <w:num w:numId="5" w16cid:durableId="1539199328">
-    <w:abstractNumId w:val="22"/>
+  <w:num w:numId="30" w16cid:durableId="1067188728">
+    <w:abstractNumId w:val="32"/>
   </w:num>
-  <w:num w:numId="6" w16cid:durableId="1626622690">
-    <w:abstractNumId w:val="9"/>
+  <w:num w:numId="31" w16cid:durableId="1077945652">
+    <w:abstractNumId w:val="25"/>
   </w:num>
-  <w:num w:numId="7" w16cid:durableId="173617801">
-    <w:abstractNumId w:val="8"/>
+  <w:num w:numId="32" w16cid:durableId="1951620178">
+    <w:abstractNumId w:val="41"/>
   </w:num>
-  <w:num w:numId="8" w16cid:durableId="98642267">
-    <w:abstractNumId w:val="42"/>
+  <w:num w:numId="33" w16cid:durableId="911819465">
+    <w:abstractNumId w:val="51"/>
   </w:num>
-  <w:num w:numId="9" w16cid:durableId="1998459187">
+  <w:num w:numId="34" w16cid:durableId="39938483">
+    <w:abstractNumId w:val="20"/>
+  </w:num>
+  <w:num w:numId="35" w16cid:durableId="115876442">
     <w:abstractNumId w:val="29"/>
   </w:num>
-  <w:num w:numId="10" w16cid:durableId="1645505033">
-    <w:abstractNumId w:val="44"/>
+  <w:num w:numId="36" w16cid:durableId="271743244">
+    <w:abstractNumId w:val="49"/>
   </w:num>
-  <w:num w:numId="11" w16cid:durableId="963392691">
-    <w:abstractNumId w:val="1"/>
+  <w:num w:numId="37" w16cid:durableId="822697177">
+    <w:abstractNumId w:val="3"/>
   </w:num>
-  <w:num w:numId="12" w16cid:durableId="1687051846">
-    <w:abstractNumId w:val="35"/>
-  </w:num>
-  <w:num w:numId="13" w16cid:durableId="1689679590">
-    <w:abstractNumId w:val="40"/>
-  </w:num>
-  <w:num w:numId="14" w16cid:durableId="1633435425">
-    <w:abstractNumId w:val="32"/>
-  </w:num>
-  <w:num w:numId="15" w16cid:durableId="879627401">
-    <w:abstractNumId w:val="6"/>
-  </w:num>
-  <w:num w:numId="16" w16cid:durableId="484785044">
-    <w:abstractNumId w:val="5"/>
-  </w:num>
-  <w:num w:numId="17" w16cid:durableId="105541229">
+  <w:num w:numId="38" w16cid:durableId="1442261357">
     <w:abstractNumId w:val="24"/>
   </w:num>
-  <w:num w:numId="18" w16cid:durableId="875199095">
-    <w:abstractNumId w:val="12"/>
-  </w:num>
-  <w:num w:numId="19" w16cid:durableId="1555239194">
-    <w:abstractNumId w:val="37"/>
-  </w:num>
-  <w:num w:numId="20" w16cid:durableId="1489859180">
-    <w:abstractNumId w:val="31"/>
-  </w:num>
-  <w:num w:numId="21" w16cid:durableId="504982169">
-    <w:abstractNumId w:val="41"/>
-  </w:num>
-  <w:num w:numId="22" w16cid:durableId="996422384">
-    <w:abstractNumId w:val="19"/>
-  </w:num>
-  <w:num w:numId="23" w16cid:durableId="1601522832">
-    <w:abstractNumId w:val="23"/>
-  </w:num>
-  <w:num w:numId="24" w16cid:durableId="1982881947">
-    <w:abstractNumId w:val="34"/>
-  </w:num>
-  <w:num w:numId="25" w16cid:durableId="1470974799">
-    <w:abstractNumId w:val="7"/>
-  </w:num>
-  <w:num w:numId="26" w16cid:durableId="2083482799">
-    <w:abstractNumId w:val="26"/>
-  </w:num>
-  <w:num w:numId="27" w16cid:durableId="482284611">
-    <w:abstractNumId w:val="18"/>
-  </w:num>
-  <w:num w:numId="28" w16cid:durableId="1783381712">
-    <w:abstractNumId w:val="3"/>
-  </w:num>
-  <w:num w:numId="29" w16cid:durableId="1077090791">
+  <w:num w:numId="39" w16cid:durableId="213977967">
     <w:abstractNumId w:val="38"/>
   </w:num>
-  <w:num w:numId="30" w16cid:durableId="1067188728">
-    <w:abstractNumId w:val="28"/>
-  </w:num>
-  <w:num w:numId="31" w16cid:durableId="1077945652">
-    <w:abstractNumId w:val="21"/>
-  </w:num>
-  <w:num w:numId="32" w16cid:durableId="1951620178">
-    <w:abstractNumId w:val="36"/>
-  </w:num>
-  <w:num w:numId="33" w16cid:durableId="911819465">
-    <w:abstractNumId w:val="45"/>
-  </w:num>
-  <w:num w:numId="34" w16cid:durableId="39938483">
-    <w:abstractNumId w:val="17"/>
-  </w:num>
-  <w:num w:numId="35" w16cid:durableId="115876442">
-    <w:abstractNumId w:val="25"/>
-  </w:num>
-  <w:num w:numId="36" w16cid:durableId="271743244">
-    <w:abstractNumId w:val="43"/>
-  </w:num>
-  <w:num w:numId="37" w16cid:durableId="822697177">
-    <w:abstractNumId w:val="2"/>
-  </w:num>
-  <w:num w:numId="38" w16cid:durableId="1442261357">
-    <w:abstractNumId w:val="20"/>
-  </w:num>
-  <w:num w:numId="39" w16cid:durableId="213977967">
-    <w:abstractNumId w:val="33"/>
-  </w:num>
   <w:num w:numId="40" w16cid:durableId="863134005">
-    <w:abstractNumId w:val="10"/>
+    <w:abstractNumId w:val="11"/>
   </w:num>
   <w:num w:numId="41" w16cid:durableId="1168210051">
     <w:abstractNumId w:val="0"/>
   </w:num>
   <w:num w:numId="42" w16cid:durableId="546140366">
+    <w:abstractNumId w:val="18"/>
+  </w:num>
+  <w:num w:numId="43" w16cid:durableId="680819969">
+    <w:abstractNumId w:val="35"/>
+  </w:num>
+  <w:num w:numId="44" w16cid:durableId="677150682">
+    <w:abstractNumId w:val="31"/>
+  </w:num>
+  <w:num w:numId="45" w16cid:durableId="35663729">
+    <w:abstractNumId w:val="17"/>
+  </w:num>
+  <w:num w:numId="46" w16cid:durableId="1380782411">
     <w:abstractNumId w:val="15"/>
   </w:num>
-  <w:num w:numId="43" w16cid:durableId="680819969">
-    <w:abstractNumId w:val="30"/>
+  <w:num w:numId="47" w16cid:durableId="1049918084">
+    <w:abstractNumId w:val="12"/>
   </w:num>
-  <w:num w:numId="44" w16cid:durableId="677150682">
-    <w:abstractNumId w:val="27"/>
+  <w:num w:numId="48" w16cid:durableId="1757822342">
+    <w:abstractNumId w:val="44"/>
   </w:num>
-  <w:num w:numId="45" w16cid:durableId="35663729">
-    <w:abstractNumId w:val="14"/>
+  <w:num w:numId="49" w16cid:durableId="498732585">
+    <w:abstractNumId w:val="1"/>
   </w:num>
-  <w:num w:numId="46" w16cid:durableId="1380782411">
-    <w:abstractNumId w:val="13"/>
+  <w:num w:numId="50" w16cid:durableId="858664118">
+    <w:abstractNumId w:val="33"/>
+  </w:num>
+  <w:num w:numId="51" w16cid:durableId="872351617">
+    <w:abstractNumId w:val="16"/>
+  </w:num>
+  <w:num w:numId="52" w16cid:durableId="712653072">
+    <w:abstractNumId w:val="22"/>
   </w:num>
   <w:numIdMacAtCleanup w:val="46"/>
 </w:numbering>
@@ -27072,6 +28694,74 @@
     <w:basedOn w:val="a0"/>
     <w:rsid w:val="00EF2CD0"/>
   </w:style>
+  <w:style w:type="table" w:styleId="6-5">
+    <w:name w:val="List Table 6 Colorful Accent 5"/>
+    <w:basedOn w:val="a1"/>
+    <w:uiPriority w:val="51"/>
+    <w:rsid w:val="001E1F97"/>
+    <w:pPr>
+      <w:spacing w:after="0" w:line="240" w:lineRule="auto"/>
+    </w:pPr>
+    <w:rPr>
+      <w:color w:val="2E74B5" w:themeColor="accent5" w:themeShade="BF"/>
+    </w:rPr>
+    <w:tblPr>
+      <w:tblStyleRowBandSize w:val="1"/>
+      <w:tblStyleColBandSize w:val="1"/>
+      <w:tblBorders>
+        <w:top w:val="single" w:sz="4" w:space="0" w:color="5B9BD5" w:themeColor="accent5"/>
+        <w:bottom w:val="single" w:sz="4" w:space="0" w:color="5B9BD5" w:themeColor="accent5"/>
+      </w:tblBorders>
+    </w:tblPr>
+    <w:tblStylePr w:type="firstRow">
+      <w:rPr>
+        <w:b/>
+        <w:bCs/>
+      </w:rPr>
+      <w:tblPr/>
+      <w:tcPr>
+        <w:tcBorders>
+          <w:bottom w:val="single" w:sz="4" w:space="0" w:color="5B9BD5" w:themeColor="accent5"/>
+        </w:tcBorders>
+      </w:tcPr>
+    </w:tblStylePr>
+    <w:tblStylePr w:type="lastRow">
+      <w:rPr>
+        <w:b/>
+        <w:bCs/>
+      </w:rPr>
+      <w:tblPr/>
+      <w:tcPr>
+        <w:tcBorders>
+          <w:top w:val="double" w:sz="4" w:space="0" w:color="5B9BD5" w:themeColor="accent5"/>
+        </w:tcBorders>
+      </w:tcPr>
+    </w:tblStylePr>
+    <w:tblStylePr w:type="firstCol">
+      <w:rPr>
+        <w:b/>
+        <w:bCs/>
+      </w:rPr>
+    </w:tblStylePr>
+    <w:tblStylePr w:type="lastCol">
+      <w:rPr>
+        <w:b/>
+        <w:bCs/>
+      </w:rPr>
+    </w:tblStylePr>
+    <w:tblStylePr w:type="band1Vert">
+      <w:tblPr/>
+      <w:tcPr>
+        <w:shd w:val="clear" w:color="auto" w:fill="DEEAF6" w:themeFill="accent5" w:themeFillTint="33"/>
+      </w:tcPr>
+    </w:tblStylePr>
+    <w:tblStylePr w:type="band1Horz">
+      <w:tblPr/>
+      <w:tcPr>
+        <w:shd w:val="clear" w:color="auto" w:fill="DEEAF6" w:themeFill="accent5" w:themeFillTint="33"/>
+      </w:tcPr>
+    </w:tblStylePr>
+  </w:style>
 </w:styles>
 </file>
 

</xml_diff>